<commit_message>
docs: update project documentation, dump instructions and .gitignore
</commit_message>
<xml_diff>
--- a/docs/Пояснительная записка.docx
+++ b/docs/Пояснительная записка.docx
@@ -562,7 +562,7 @@
           <w:r>
             <w:fldChar w:fldCharType="separate"/>
           </w:r>
-          <w:hyperlink w:anchor="_Toc242696310" w:history="1">
+          <w:hyperlink w:anchor="_Toc242780712" w:history="1">
             <w:r>
               <w:rPr>
                 <w:rStyle w:val="af0"/>
@@ -589,7 +589,7 @@
                 <w:noProof/>
                 <w:webHidden/>
               </w:rPr>
-              <w:instrText xml:space="preserve"> PAGEREF _Toc242696310 \h </w:instrText>
+              <w:instrText xml:space="preserve"> PAGEREF _Toc242780712 \h </w:instrText>
             </w:r>
             <w:r>
               <w:rPr>
@@ -633,7 +633,7 @@
               <w14:ligatures w14:val="standardContextual"/>
             </w:rPr>
           </w:pPr>
-          <w:hyperlink w:anchor="_Toc242696311" w:history="1">
+          <w:hyperlink w:anchor="_Toc242780713" w:history="1">
             <w:r>
               <w:rPr>
                 <w:rStyle w:val="af0"/>
@@ -660,7 +660,7 @@
                 <w:noProof/>
                 <w:webHidden/>
               </w:rPr>
-              <w:instrText xml:space="preserve"> PAGEREF _Toc242696311 \h </w:instrText>
+              <w:instrText xml:space="preserve"> PAGEREF _Toc242780713 \h </w:instrText>
             </w:r>
             <w:r>
               <w:rPr>
@@ -704,7 +704,7 @@
               <w14:ligatures w14:val="standardContextual"/>
             </w:rPr>
           </w:pPr>
-          <w:hyperlink w:anchor="_Toc242696312" w:history="1">
+          <w:hyperlink w:anchor="_Toc242780714" w:history="1">
             <w:r>
               <w:rPr>
                 <w:rStyle w:val="af0"/>
@@ -731,7 +731,7 @@
                 <w:noProof/>
                 <w:webHidden/>
               </w:rPr>
-              <w:instrText xml:space="preserve"> PAGEREF _Toc242696312 \h </w:instrText>
+              <w:instrText xml:space="preserve"> PAGEREF _Toc242780714 \h </w:instrText>
             </w:r>
             <w:r>
               <w:rPr>
@@ -775,7 +775,7 @@
               <w14:ligatures w14:val="standardContextual"/>
             </w:rPr>
           </w:pPr>
-          <w:hyperlink w:anchor="_Toc242696313" w:history="1">
+          <w:hyperlink w:anchor="_Toc242780715" w:history="1">
             <w:r>
               <w:rPr>
                 <w:rStyle w:val="af0"/>
@@ -802,7 +802,7 @@
                 <w:noProof/>
                 <w:webHidden/>
               </w:rPr>
-              <w:instrText xml:space="preserve"> PAGEREF _Toc242696313 \h </w:instrText>
+              <w:instrText xml:space="preserve"> PAGEREF _Toc242780715 \h </w:instrText>
             </w:r>
             <w:r>
               <w:rPr>
@@ -846,7 +846,7 @@
               <w14:ligatures w14:val="standardContextual"/>
             </w:rPr>
           </w:pPr>
-          <w:hyperlink w:anchor="_Toc242696314" w:history="1">
+          <w:hyperlink w:anchor="_Toc242780716" w:history="1">
             <w:r>
               <w:rPr>
                 <w:rStyle w:val="af0"/>
@@ -873,7 +873,7 @@
                 <w:noProof/>
                 <w:webHidden/>
               </w:rPr>
-              <w:instrText xml:space="preserve"> PAGEREF _Toc242696314 \h </w:instrText>
+              <w:instrText xml:space="preserve"> PAGEREF _Toc242780716 \h </w:instrText>
             </w:r>
             <w:r>
               <w:rPr>
@@ -917,7 +917,7 @@
               <w14:ligatures w14:val="standardContextual"/>
             </w:rPr>
           </w:pPr>
-          <w:hyperlink w:anchor="_Toc242696315" w:history="1">
+          <w:hyperlink w:anchor="_Toc242780717" w:history="1">
             <w:r>
               <w:rPr>
                 <w:rStyle w:val="af0"/>
@@ -944,7 +944,7 @@
                 <w:noProof/>
                 <w:webHidden/>
               </w:rPr>
-              <w:instrText xml:space="preserve"> PAGEREF _Toc242696315 \h </w:instrText>
+              <w:instrText xml:space="preserve"> PAGEREF _Toc242780717 \h </w:instrText>
             </w:r>
             <w:r>
               <w:rPr>
@@ -988,7 +988,7 @@
               <w14:ligatures w14:val="standardContextual"/>
             </w:rPr>
           </w:pPr>
-          <w:hyperlink w:anchor="_Toc242696316" w:history="1">
+          <w:hyperlink w:anchor="_Toc242780718" w:history="1">
             <w:r>
               <w:rPr>
                 <w:rStyle w:val="af0"/>
@@ -1016,7 +1016,7 @@
                 <w:noProof/>
                 <w:webHidden/>
               </w:rPr>
-              <w:instrText xml:space="preserve"> PAGEREF _Toc242696316 \h </w:instrText>
+              <w:instrText xml:space="preserve"> PAGEREF _Toc242780718 \h </w:instrText>
             </w:r>
             <w:r>
               <w:rPr>
@@ -1036,7 +1036,7 @@
                 <w:noProof/>
                 <w:webHidden/>
               </w:rPr>
-              <w:t>10</w:t>
+              <w:t>12</w:t>
             </w:r>
             <w:r>
               <w:rPr>
@@ -1060,7 +1060,7 @@
               <w14:ligatures w14:val="standardContextual"/>
             </w:rPr>
           </w:pPr>
-          <w:hyperlink w:anchor="_Toc242696317" w:history="1">
+          <w:hyperlink w:anchor="_Toc242780719" w:history="1">
             <w:r>
               <w:rPr>
                 <w:rStyle w:val="af0"/>
@@ -1087,7 +1087,7 @@
                 <w:noProof/>
                 <w:webHidden/>
               </w:rPr>
-              <w:instrText xml:space="preserve"> PAGEREF _Toc242696317 \h </w:instrText>
+              <w:instrText xml:space="preserve"> PAGEREF _Toc242780719 \h </w:instrText>
             </w:r>
             <w:r>
               <w:rPr>
@@ -1107,7 +1107,7 @@
                 <w:noProof/>
                 <w:webHidden/>
               </w:rPr>
-              <w:t>10</w:t>
+              <w:t>12</w:t>
             </w:r>
             <w:r>
               <w:rPr>
@@ -1131,7 +1131,7 @@
               <w14:ligatures w14:val="standardContextual"/>
             </w:rPr>
           </w:pPr>
-          <w:hyperlink w:anchor="_Toc242696318" w:history="1">
+          <w:hyperlink w:anchor="_Toc242780720" w:history="1">
             <w:r>
               <w:rPr>
                 <w:rStyle w:val="af0"/>
@@ -1158,7 +1158,7 @@
                 <w:noProof/>
                 <w:webHidden/>
               </w:rPr>
-              <w:instrText xml:space="preserve"> PAGEREF _Toc242696318 \h </w:instrText>
+              <w:instrText xml:space="preserve"> PAGEREF _Toc242780720 \h </w:instrText>
             </w:r>
             <w:r>
               <w:rPr>
@@ -1178,7 +1178,7 @@
                 <w:noProof/>
                 <w:webHidden/>
               </w:rPr>
-              <w:t>10</w:t>
+              <w:t>12</w:t>
             </w:r>
             <w:r>
               <w:rPr>
@@ -1202,7 +1202,7 @@
               <w14:ligatures w14:val="standardContextual"/>
             </w:rPr>
           </w:pPr>
-          <w:hyperlink w:anchor="_Toc242696319" w:history="1">
+          <w:hyperlink w:anchor="_Toc242780721" w:history="1">
             <w:r>
               <w:rPr>
                 <w:rStyle w:val="af0"/>
@@ -1229,7 +1229,7 @@
                 <w:noProof/>
                 <w:webHidden/>
               </w:rPr>
-              <w:instrText xml:space="preserve"> PAGEREF _Toc242696319 \h </w:instrText>
+              <w:instrText xml:space="preserve"> PAGEREF _Toc242780721 \h </w:instrText>
             </w:r>
             <w:r>
               <w:rPr>
@@ -1249,7 +1249,7 @@
                 <w:noProof/>
                 <w:webHidden/>
               </w:rPr>
-              <w:t>10</w:t>
+              <w:t>12</w:t>
             </w:r>
             <w:r>
               <w:rPr>
@@ -1273,7 +1273,7 @@
               <w14:ligatures w14:val="standardContextual"/>
             </w:rPr>
           </w:pPr>
-          <w:hyperlink w:anchor="_Toc242696320" w:history="1">
+          <w:hyperlink w:anchor="_Toc242780722" w:history="1">
             <w:r>
               <w:rPr>
                 <w:rStyle w:val="af0"/>
@@ -1300,7 +1300,7 @@
                 <w:noProof/>
                 <w:webHidden/>
               </w:rPr>
-              <w:instrText xml:space="preserve"> PAGEREF _Toc242696320 \h </w:instrText>
+              <w:instrText xml:space="preserve"> PAGEREF _Toc242780722 \h </w:instrText>
             </w:r>
             <w:r>
               <w:rPr>
@@ -1320,7 +1320,7 @@
                 <w:noProof/>
                 <w:webHidden/>
               </w:rPr>
-              <w:t>10</w:t>
+              <w:t>12</w:t>
             </w:r>
             <w:r>
               <w:rPr>
@@ -1344,7 +1344,7 @@
               <w14:ligatures w14:val="standardContextual"/>
             </w:rPr>
           </w:pPr>
-          <w:hyperlink w:anchor="_Toc242696321" w:history="1">
+          <w:hyperlink w:anchor="_Toc242780723" w:history="1">
             <w:r>
               <w:rPr>
                 <w:rStyle w:val="af0"/>
@@ -1371,7 +1371,7 @@
                 <w:noProof/>
                 <w:webHidden/>
               </w:rPr>
-              <w:instrText xml:space="preserve"> PAGEREF _Toc242696321 \h </w:instrText>
+              <w:instrText xml:space="preserve"> PAGEREF _Toc242780723 \h </w:instrText>
             </w:r>
             <w:r>
               <w:rPr>
@@ -1391,7 +1391,7 @@
                 <w:noProof/>
                 <w:webHidden/>
               </w:rPr>
-              <w:t>10</w:t>
+              <w:t>12</w:t>
             </w:r>
             <w:r>
               <w:rPr>
@@ -1415,7 +1415,7 @@
               <w14:ligatures w14:val="standardContextual"/>
             </w:rPr>
           </w:pPr>
-          <w:hyperlink w:anchor="_Toc242696322" w:history="1">
+          <w:hyperlink w:anchor="_Toc242780724" w:history="1">
             <w:r>
               <w:rPr>
                 <w:rStyle w:val="af0"/>
@@ -1443,7 +1443,7 @@
                 <w:noProof/>
                 <w:webHidden/>
               </w:rPr>
-              <w:instrText xml:space="preserve"> PAGEREF _Toc242696322 \h </w:instrText>
+              <w:instrText xml:space="preserve"> PAGEREF _Toc242780724 \h </w:instrText>
             </w:r>
             <w:r>
               <w:rPr>
@@ -1463,7 +1463,7 @@
                 <w:noProof/>
                 <w:webHidden/>
               </w:rPr>
-              <w:t>11</w:t>
+              <w:t>13</w:t>
             </w:r>
             <w:r>
               <w:rPr>
@@ -1487,7 +1487,7 @@
               <w14:ligatures w14:val="standardContextual"/>
             </w:rPr>
           </w:pPr>
-          <w:hyperlink w:anchor="_Toc242696323" w:history="1">
+          <w:hyperlink w:anchor="_Toc242780725" w:history="1">
             <w:r>
               <w:rPr>
                 <w:rStyle w:val="af0"/>
@@ -1515,7 +1515,7 @@
                 <w:noProof/>
                 <w:webHidden/>
               </w:rPr>
-              <w:instrText xml:space="preserve"> PAGEREF _Toc242696323 \h </w:instrText>
+              <w:instrText xml:space="preserve"> PAGEREF _Toc242780725 \h </w:instrText>
             </w:r>
             <w:r>
               <w:rPr>
@@ -1535,7 +1535,7 @@
                 <w:noProof/>
                 <w:webHidden/>
               </w:rPr>
-              <w:t>12</w:t>
+              <w:t>14</w:t>
             </w:r>
             <w:r>
               <w:rPr>
@@ -1559,7 +1559,7 @@
               <w14:ligatures w14:val="standardContextual"/>
             </w:rPr>
           </w:pPr>
-          <w:hyperlink w:anchor="_Toc242696324" w:history="1">
+          <w:hyperlink w:anchor="_Toc242780726" w:history="1">
             <w:r>
               <w:rPr>
                 <w:rStyle w:val="af0"/>
@@ -1586,7 +1586,7 @@
                 <w:noProof/>
                 <w:webHidden/>
               </w:rPr>
-              <w:instrText xml:space="preserve"> PAGEREF _Toc242696324 \h </w:instrText>
+              <w:instrText xml:space="preserve"> PAGEREF _Toc242780726 \h </w:instrText>
             </w:r>
             <w:r>
               <w:rPr>
@@ -1606,7 +1606,7 @@
                 <w:noProof/>
                 <w:webHidden/>
               </w:rPr>
-              <w:t>12</w:t>
+              <w:t>14</w:t>
             </w:r>
             <w:r>
               <w:rPr>
@@ -1630,7 +1630,7 @@
               <w14:ligatures w14:val="standardContextual"/>
             </w:rPr>
           </w:pPr>
-          <w:hyperlink w:anchor="_Toc242696325" w:history="1">
+          <w:hyperlink w:anchor="_Toc242780727" w:history="1">
             <w:r>
               <w:rPr>
                 <w:rStyle w:val="af0"/>
@@ -1657,7 +1657,7 @@
                 <w:noProof/>
                 <w:webHidden/>
               </w:rPr>
-              <w:instrText xml:space="preserve"> PAGEREF _Toc242696325 \h </w:instrText>
+              <w:instrText xml:space="preserve"> PAGEREF _Toc242780727 \h </w:instrText>
             </w:r>
             <w:r>
               <w:rPr>
@@ -1677,7 +1677,7 @@
                 <w:noProof/>
                 <w:webHidden/>
               </w:rPr>
-              <w:t>12</w:t>
+              <w:t>14</w:t>
             </w:r>
             <w:r>
               <w:rPr>
@@ -1701,7 +1701,7 @@
               <w14:ligatures w14:val="standardContextual"/>
             </w:rPr>
           </w:pPr>
-          <w:hyperlink w:anchor="_Toc242696326" w:history="1">
+          <w:hyperlink w:anchor="_Toc242780728" w:history="1">
             <w:r>
               <w:rPr>
                 <w:rStyle w:val="af0"/>
@@ -1729,7 +1729,7 @@
                 <w:noProof/>
                 <w:webHidden/>
               </w:rPr>
-              <w:instrText xml:space="preserve"> PAGEREF _Toc242696326 \h </w:instrText>
+              <w:instrText xml:space="preserve"> PAGEREF _Toc242780728 \h </w:instrText>
             </w:r>
             <w:r>
               <w:rPr>
@@ -1749,7 +1749,7 @@
                 <w:noProof/>
                 <w:webHidden/>
               </w:rPr>
-              <w:t>13</w:t>
+              <w:t>15</w:t>
             </w:r>
             <w:r>
               <w:rPr>
@@ -1773,7 +1773,7 @@
               <w14:ligatures w14:val="standardContextual"/>
             </w:rPr>
           </w:pPr>
-          <w:hyperlink w:anchor="_Toc242696327" w:history="1">
+          <w:hyperlink w:anchor="_Toc242780729" w:history="1">
             <w:r>
               <w:rPr>
                 <w:rStyle w:val="af0"/>
@@ -1801,7 +1801,7 @@
                 <w:noProof/>
                 <w:webHidden/>
               </w:rPr>
-              <w:instrText xml:space="preserve"> PAGEREF _Toc242696327 \h </w:instrText>
+              <w:instrText xml:space="preserve"> PAGEREF _Toc242780729 \h </w:instrText>
             </w:r>
             <w:r>
               <w:rPr>
@@ -1821,7 +1821,7 @@
                 <w:noProof/>
                 <w:webHidden/>
               </w:rPr>
-              <w:t>14</w:t>
+              <w:t>16</w:t>
             </w:r>
             <w:r>
               <w:rPr>
@@ -1871,7 +1871,7 @@
         <w:pStyle w:val="af1"/>
       </w:pPr>
       <w:bookmarkStart w:id="2" w:name="_Toc231592560"/>
-      <w:bookmarkStart w:id="3" w:name="_Toc242696310"/>
+      <w:bookmarkStart w:id="3" w:name="_Toc242780712"/>
       <w:r>
         <w:lastRenderedPageBreak/>
         <w:t>Введение</w:t>
@@ -1884,7 +1884,7 @@
         <w:ind w:left="284" w:right="284"/>
       </w:pPr>
       <w:r>
-        <w:t>Разработка программного обеспечения не заканчивается после успешной сборки приложения. По мере развития проекта меняются исходный код, зависимости и структура базы данных. Со временем появляются дублирование логики, сложные связи между компонентами и неэффективные запросы. Такие проблемы не всегда приводят к ошибкам компиляции, но усложняют сопровождение программы.</w:t>
+        <w:t>По мере развития .NET-проектов изменяются исходный код и структура базы данных. В процессе разработки могут возникать дублирование логики, сложные связи между компонентами и неэффективные запросы. Такие проблемы не всегда приводят к ошибкам компиляции, но могут усложнять дальнейшее сопровождение программы.</w:t>
       </w:r>
     </w:p>
     <w:p>
@@ -1892,7 +1892,7 @@
         <w:ind w:left="284" w:right="284"/>
       </w:pPr>
       <w:r>
-        <w:t>Для .NET-проектов важно проверять не только код на C#, но и подключённые пакеты, конфигурацию и взаимодействие с базой данных. Ручная проверка этих элементов занимает время, а раздельное хранение результатов затрудняет сравнение состояния проекта после изменений.</w:t>
+        <w:t>Для .NET-проектов важно проверять не только исходный код на C#, но и конфигурацию приложения, структуру базы данных и взаимодействие с ней. Ручная проверка этих элементов требует времени, а раздельное хранение результатов затрудняет сравнение состояния проекта после внесённых изменений.</w:t>
       </w:r>
     </w:p>
     <w:p>
@@ -1924,7 +1924,7 @@
         <w:ind w:left="284" w:right="284"/>
       </w:pPr>
       <w:r>
-        <w:t>Для достижения цели необходимо изучить предметную область, определить требования к системе, спроектировать её архитектуру и базу данных, разработать компоненты анализа и проверить их работоспособность.</w:t>
+        <w:t>Для достижения поставленной цели необходимо решить следующие задачи:</w:t>
       </w:r>
     </w:p>
     <w:p>
@@ -1932,7 +1932,16 @@
         <w:ind w:left="284" w:right="284"/>
       </w:pPr>
       <w:r>
-        <w:t>Предполагаемый стек технологий включает C#, ASP.NET Core Web API, Entity Framework Core и PostgreSQL. Для статического анализа кода планируется использовать Roslyn. Доступ к системе предусматривается через настольное приложение, командную строку и Telegram-бота.</w:t>
+        <w:t>–</w:t>
+      </w:r>
+      <w:r>
+        <w:t> </w:t>
+      </w:r>
+      <w:r>
+        <w:t xml:space="preserve">изучить предметную область и определить проблемы, возникающие при разработке и сопровождении .NET-проектов и </w:t>
+      </w:r>
+      <w:r>
+        <w:t>связанных баз данных;</w:t>
       </w:r>
     </w:p>
     <w:p>
@@ -1940,9 +1949,93 @@
         <w:ind w:left="284" w:right="284"/>
       </w:pPr>
       <w:r>
+        <w:t>–</w:t>
+      </w:r>
+      <w:r>
+        <w:t> </w:t>
+      </w:r>
+      <w:r>
+        <w:t>спроектировать архитектуру системы и структуру базы данных;</w:t>
+      </w:r>
+    </w:p>
+    <w:p>
+      <w:pPr>
+        <w:ind w:left="284" w:right="284"/>
+      </w:pPr>
+      <w:r>
+        <w:t>–</w:t>
+      </w:r>
+      <w:r>
+        <w:t> </w:t>
+      </w:r>
+      <w:r>
+        <w:t>разработать компоненты анализа исходного кода, структуры базы данных и отдельных признаков потенциальных проблем;</w:t>
+      </w:r>
+    </w:p>
+    <w:p>
+      <w:pPr>
+        <w:ind w:left="284" w:right="284"/>
+      </w:pPr>
+      <w:r>
         <w:lastRenderedPageBreak/>
-        <w:t>Практическая значимость работы заключается в объединении результатов нескольких проверок в одном месте. Система поможет обнаруживать потенциальные проблемы и отслеживать изменения между запусками анализа, но не заменит полноценное тестирование и аудит безопасности.</w:t>
-      </w:r>
+        <w:t>–</w:t>
+      </w:r>
+      <w:r>
+        <w:t> </w:t>
+      </w:r>
+      <w:r>
+        <w:t>реализовать серверную часть и пользовательские интерфейсы для взаимодействия с системой;</w:t>
+      </w:r>
+    </w:p>
+    <w:p>
+      <w:pPr>
+        <w:ind w:left="284" w:right="284"/>
+      </w:pPr>
+      <w:r>
+        <w:t>–</w:t>
+      </w:r>
+      <w:r>
+        <w:t> </w:t>
+      </w:r>
+      <w:r>
+        <w:t>разработать алгоритм проведения анализа и формирования отчётов;</w:t>
+      </w:r>
+    </w:p>
+    <w:p>
+      <w:pPr>
+        <w:ind w:left="284" w:right="284"/>
+      </w:pPr>
+      <w:r>
+        <w:t>–</w:t>
+      </w:r>
+      <w:r>
+        <w:t> </w:t>
+      </w:r>
+      <w:r>
+        <w:t>провести тестирование системы</w:t>
+      </w:r>
+      <w:r>
+        <w:t>.</w:t>
+      </w:r>
+    </w:p>
+    <w:p>
+      <w:pPr>
+        <w:ind w:left="284" w:right="284"/>
+      </w:pPr>
+      <w:r>
+        <w:t>Таким образом, разрабатываемая система должна объединить несколько направлений анализа .NET-проектов и связанных баз данных в одном программном решении. Основное внимание уделяется выявлению потенциальных проблем в исходном коде, структуре базы данных и взаимодействии приложения с ней. Сохранение результатов проверок позволит пользователю просматривать историю анализа и сравнивать полученные данные после внесения изменений в проект.</w:t>
+      </w:r>
+      <w:r>
+        <w:t xml:space="preserve"> </w:t>
+      </w:r>
+      <w:r>
+        <w:t>Результатом работы должен стать программный продукт, позволяющий выполнять предусмотренные проверки и представлять их результаты в понятном для разработчика виде.</w:t>
+      </w:r>
+    </w:p>
+    <w:p>
+      <w:pPr>
+        <w:ind w:left="284" w:right="284"/>
+      </w:pPr>
     </w:p>
     <w:p>
       <w:pPr>
@@ -1957,7 +2050,7 @@
         <w:ind w:left="284" w:right="284" w:firstLine="709"/>
       </w:pPr>
       <w:bookmarkStart w:id="4" w:name="_Toc231592561"/>
-      <w:bookmarkStart w:id="5" w:name="_Toc242696311"/>
+      <w:bookmarkStart w:id="5" w:name="_Toc242780713"/>
       <w:r>
         <w:lastRenderedPageBreak/>
         <w:t>1 </w:t>
@@ -1984,7 +2077,7 @@
         </w:tabs>
         <w:ind w:left="284" w:right="284" w:firstLine="709"/>
       </w:pPr>
-      <w:bookmarkStart w:id="8" w:name="_Toc242696312"/>
+      <w:bookmarkStart w:id="8" w:name="_Toc242780714"/>
       <w:r>
         <w:t>1.1</w:t>
       </w:r>
@@ -2009,7 +2102,7 @@
         <w:rPr>
           <w:lang w:eastAsia="ru-RU"/>
         </w:rPr>
-        <w:t>Разрабатываемая система предназначена для анализа .NET-проектов на нескольких уровнях: исходного кода, зависимостей, структуры базы данных и взаимодействия приложения с ней. Проверки должны помогать находить участки, требующие внимания при разработке и сопровождении программного обеспечения.</w:t>
+        <w:t>Разрабатываемая система предназначена для анализа .NET-проектов на нескольких уровнях: исходного кода, структуры базы данных и взаимодействия приложения с ней. Проверки должны помогать находить участки, требующие внимания при разработке и сопровождении программного обеспечения.</w:t>
       </w:r>
     </w:p>
     <w:p>
@@ -2037,7 +2130,7 @@
         <w:rPr>
           <w:lang w:eastAsia="ru-RU"/>
         </w:rPr>
-        <w:t>Отдельного внимания требуют сторонние пакеты. Устаревшие версии библиотек могут содержать известные уязвимости или создавать проблемы совместимости. Поэтому анализ сведений о зависимостях полезен при оценке состояния проекта, хотя наличие пакета само по себе ещё не означает, что приложение уязвимо.</w:t>
+        <w:t>Важная часть анализа связана с реляционными базами данных. Первичные и внешние ключи обеспечивают идентификацию записей и целостность связей между таблицами. Ошибки в структуре могут приводить к появлению несогласованных данных. Нормализация помогает уменьшить избыточность, однако не гарантирует высокой производительности: на неё также влияют индексы, объём данных и характер запросов.</w:t>
       </w:r>
     </w:p>
     <w:p>
@@ -2051,7 +2144,7 @@
         <w:rPr>
           <w:lang w:eastAsia="ru-RU"/>
         </w:rPr>
-        <w:t>Важная часть анализа связана с реляционными базами данных. Первичные и внешние ключи обеспечивают идентификацию записей и целостность связей между таблицами. Ошибки в структуре могут приводить к появлению несогласованных данных. Нормализация помогает уменьшить избыточность, однако не гарантирует высокой производительности: на неё также влияют индексы, объём данных и характер запросов.</w:t>
+        <w:t>Для получения сведений о структуре PostgreSQL можно обращаться к системным каталогам и метаданным СУБД. Это позволяет проверять таблицы, столбцы, ключи и ограничения без анализа пользовательских записей. При этом отсутствие определённого элемента, например индекса, не всегда является ошибкой: его необходимость зависит от реальной нагрузки.</w:t>
       </w:r>
     </w:p>
     <w:p>
@@ -2065,14 +2158,14 @@
         <w:rPr>
           <w:lang w:eastAsia="ru-RU"/>
         </w:rPr>
-        <w:t xml:space="preserve">Для получения сведений о структуре PostgreSQL можно обращаться к системным каталогам и метаданным СУБД. Это позволяет проверять таблицы, столбцы, ключи и ограничения без анализа пользовательских </w:t>
+        <w:t xml:space="preserve">В .NET для работы с базами данных часто применяется Entity Framework Core. Он упрощает взаимодействие с данными, но не исключает </w:t>
       </w:r>
       <w:r>
         <w:rPr>
           <w:lang w:eastAsia="ru-RU"/>
         </w:rPr>
         <w:lastRenderedPageBreak/>
-        <w:t>записей. При этом отсутствие определённого элемента, например индекса, не всегда является ошибкой – его необходимость зависит от реальной нагрузки.</w:t>
+        <w:t>неэффективных запросов. Например, проблема N+1 возникает, когда приложение сначала получает список объектов, а затем выполняет отдельный запрос для каждого из них. Подобные ситуации могут увеличивать нагрузку на базу данных и время ответа приложения.</w:t>
       </w:r>
     </w:p>
     <w:p>
@@ -2086,7 +2179,7 @@
         <w:rPr>
           <w:lang w:eastAsia="ru-RU"/>
         </w:rPr>
-        <w:t>В .NET для работы с базами данных часто применяется Entity Framework Core. Он упрощает взаимодействие с данными, но не исключает неэффективных запросов. Например, проблема N+1 возникает, когда приложение сначала получает список объектов, а затем выполняет отдельный запрос для каждого из них. Подобные ситуации могут увеличивать нагрузку на базу данных и время ответа приложения.</w:t>
+        <w:t>Автоматизированные проверки могут выявлять отдельные признаки проблем безопасности. К ним относятся пароли и ключи, оставленные в исходном коде, чувствительные данные в конфигурационных файлах, потенциально опасные способы формирования SQL-запросов и настройки ASP.NET Core, которые могут снижать безопасность приложения. Результаты таких проверок требуют дополнительной оценки разработчиком, поскольку найденный признак не всегда означает наличие реальной уязвимости.</w:t>
       </w:r>
     </w:p>
     <w:p>
@@ -2100,7 +2193,7 @@
         <w:rPr>
           <w:lang w:eastAsia="ru-RU"/>
         </w:rPr>
-        <w:t>Автоматизированные проверки могут также искать некоторые признаки проблем безопасности: секреты, случайно оставленные в исходном коде, и потенциально опасные способы формирования SQL-запросов. Такие результаты требуют проверки разработчиком, поскольку статический анализ не всегда позволяет определить, насколько опасна конкретная конструкция в реальном контексте.</w:t>
+        <w:t>Для каждого обнаруженного случая важно сохранять описание, категорию, серьёзность и место обнаружения. Результаты разных анализаторов следует приводить к единому формату. Вместе с диагностическими сообщениями необходимо хранить сведения о запусках анализа, чтобы пользователь мог возвращаться к прежним отчётам и сравнивать их после изменения проекта.</w:t>
       </w:r>
     </w:p>
     <w:p>
@@ -2114,7 +2207,7 @@
         <w:rPr>
           <w:lang w:eastAsia="ru-RU"/>
         </w:rPr>
-        <w:t>Для каждого обнаруженного случая важно сохранять описание, категорию, серьёзность и место обнаружения. Результаты разных анализаторов следует приводить к единому формату. Вместе с диагностическими сообщениями необходимо хранить сведения о запусках анализа, чтобы пользователь мог возвращаться к прежним отчётам и сравнивать их после изменения проекта.</w:t>
+        <w:t>Архитектура системы должна допускать разделение проверок на независимые компоненты. Например, отдельные анализаторы могут отвечать за код C#, структуру базы данных и поиск потенциально неэффективных запросов. Серверная часть будет координировать их работу и сохранять результаты в базе данных.</w:t>
       </w:r>
     </w:p>
     <w:p>
@@ -2128,7 +2221,7 @@
         <w:rPr>
           <w:lang w:eastAsia="ru-RU"/>
         </w:rPr>
-        <w:t>Архитектура системы должна допускать разделение проверок на независимые компоненты. Например, отдельные анализаторы могут отвечать за код C#, структуру базы данных и поиск потенциально неэффективных запросов. Серверная часть на ASP.NET Core Web API будет координировать их работу и сохранять результаты в PostgreSQL с использованием Entity Framework Core.</w:t>
+        <w:t>Предусматриваются три способа взаимодействия с системой: настольное приложение для управления проектами и просмотра отчётов, командная строка для запуска проверок и автоматизации, а также чат-бот для отдельных операций и уведомлений. Все интерфейсы должны использовать общую серверную часть, чтобы логика анализа не дублировалась.</w:t>
       </w:r>
     </w:p>
     <w:p>
@@ -2142,27 +2235,7 @@
         <w:rPr>
           <w:lang w:eastAsia="ru-RU"/>
         </w:rPr>
-        <w:t>Предусматриваются три способа взаимодействия с системой: настольное приложение для управления проектами и просмотра отчётов, командная строка для запуска проверок и автоматизации, а также Telegram-</w:t>
-      </w:r>
-      <w:r>
-        <w:rPr>
-          <w:lang w:eastAsia="ru-RU"/>
-        </w:rPr>
         <w:lastRenderedPageBreak/>
-        <w:t>бот для отдельных операций и уведомлений. Все интерфейсы должны использовать общую серверную часть, чтобы логика анализа не дублировалась.</w:t>
-      </w:r>
-    </w:p>
-    <w:p>
-      <w:pPr>
-        <w:ind w:left="284" w:right="284"/>
-        <w:rPr>
-          <w:lang w:eastAsia="ru-RU"/>
-        </w:rPr>
-      </w:pPr>
-      <w:r>
-        <w:rPr>
-          <w:lang w:eastAsia="ru-RU"/>
-        </w:rPr>
         <w:t>Таким образом, предметная область охватывает автоматизированный поиск отдельных проблем в коде и базе данных, обработку результатов и отслеживание изменений между проверками. Возможности системы будут ограничены реализованными правилами и доступными данными, поэтому её выводы следует рассматривать как помощь разработчику, а не как окончательную оценку качества программы.</w:t>
       </w:r>
     </w:p>
@@ -2179,7 +2252,7 @@
         <w:ind w:left="284" w:right="284" w:firstLine="709"/>
       </w:pPr>
       <w:bookmarkStart w:id="10" w:name="_Toc231592564"/>
-      <w:bookmarkStart w:id="11" w:name="_Toc242696313"/>
+      <w:bookmarkStart w:id="11" w:name="_Toc242780715"/>
       <w:r>
         <w:t>1.2 </w:t>
       </w:r>
@@ -2252,7 +2325,7 @@
       </w:r>
       <w:r>
         <w:rPr>
-          <w:lang w:val="en-US" w:eastAsia="ru-RU"/>
+          <w:lang w:eastAsia="ru-RU"/>
         </w:rPr>
         <w:t> </w:t>
       </w:r>
@@ -2278,7 +2351,7 @@
       </w:r>
       <w:r>
         <w:rPr>
-          <w:lang w:val="en-US" w:eastAsia="ru-RU"/>
+          <w:lang w:eastAsia="ru-RU"/>
         </w:rPr>
         <w:t> </w:t>
       </w:r>
@@ -2304,7 +2377,7 @@
       </w:r>
       <w:r>
         <w:rPr>
-          <w:lang w:val="en-US" w:eastAsia="ru-RU"/>
+          <w:lang w:eastAsia="ru-RU"/>
         </w:rPr>
         <w:t> </w:t>
       </w:r>
@@ -2312,7 +2385,7 @@
         <w:rPr>
           <w:lang w:eastAsia="ru-RU"/>
         </w:rPr>
-        <w:t>поиск предусмотренных правилами признаков потенциально неэффективных запросов и проблем безопасности;</w:t>
+        <w:t>поиск предусмотренных правилами признаков потенциально неэффективных SQL-запросов, включая повторяющиеся обращения и возможные случаи возникновения проблемы N+1;</w:t>
       </w:r>
     </w:p>
     <w:p>
@@ -2330,7 +2403,7 @@
       </w:r>
       <w:r>
         <w:rPr>
-          <w:lang w:val="en-US" w:eastAsia="ru-RU"/>
+          <w:lang w:eastAsia="ru-RU"/>
         </w:rPr>
         <w:t> </w:t>
       </w:r>
@@ -2352,12 +2425,38 @@
         <w:rPr>
           <w:lang w:eastAsia="ru-RU"/>
         </w:rPr>
+        <w:t>–</w:t>
+      </w:r>
+      <w:r>
+        <w:rPr>
+          <w:lang w:eastAsia="ru-RU"/>
+        </w:rPr>
+        <w:t> </w:t>
+      </w:r>
+      <w:r>
+        <w:rPr>
+          <w:lang w:eastAsia="ru-RU"/>
+        </w:rPr>
+        <w:t>сохранение сведений о проектах, запусках анализа и диагностических сообщениях;</w:t>
+      </w:r>
+    </w:p>
+    <w:p>
+      <w:pPr>
+        <w:ind w:left="284" w:right="284"/>
+        <w:rPr>
+          <w:lang w:eastAsia="ru-RU"/>
+        </w:rPr>
+      </w:pPr>
+      <w:r>
+        <w:rPr>
+          <w:lang w:eastAsia="ru-RU"/>
+        </w:rPr>
         <w:lastRenderedPageBreak/>
         <w:t>–</w:t>
       </w:r>
       <w:r>
         <w:rPr>
-          <w:lang w:val="en-US" w:eastAsia="ru-RU"/>
+          <w:lang w:eastAsia="ru-RU"/>
         </w:rPr>
         <w:t> </w:t>
       </w:r>
@@ -2365,7 +2464,7 @@
         <w:rPr>
           <w:lang w:eastAsia="ru-RU"/>
         </w:rPr>
-        <w:t>сохранение сведений о проектах, запусках анализа и диагностических сообщениях;</w:t>
+        <w:t>просмотр предыдущих результатов и сравнение отчётов;</w:t>
       </w:r>
     </w:p>
     <w:p>
@@ -2383,7 +2482,7 @@
       </w:r>
       <w:r>
         <w:rPr>
-          <w:lang w:val="en-US" w:eastAsia="ru-RU"/>
+          <w:lang w:eastAsia="ru-RU"/>
         </w:rPr>
         <w:t> </w:t>
       </w:r>
@@ -2391,7 +2490,7 @@
         <w:rPr>
           <w:lang w:eastAsia="ru-RU"/>
         </w:rPr>
-        <w:t>просмотр предыдущих результатов и сравнение отчётов;</w:t>
+        <w:t>предоставление функций системы через настольное приложение, командную строку и чат-бот;</w:t>
       </w:r>
     </w:p>
     <w:p>
@@ -2409,7 +2508,7 @@
       </w:r>
       <w:r>
         <w:rPr>
-          <w:lang w:val="en-US" w:eastAsia="ru-RU"/>
+          <w:lang w:eastAsia="ru-RU"/>
         </w:rPr>
         <w:t> </w:t>
       </w:r>
@@ -2417,7 +2516,7 @@
         <w:rPr>
           <w:lang w:eastAsia="ru-RU"/>
         </w:rPr>
-        <w:t>предоставление функций системы через настольное приложение, командную строку и Telegram-бота;</w:t>
+        <w:t>проверка исходного кода и конфигурационных файлов на наличие предусмотренных правилами признаков потенциальных проблем безопасности;</w:t>
       </w:r>
     </w:p>
     <w:p>
@@ -2435,7 +2534,7 @@
       </w:r>
       <w:r>
         <w:rPr>
-          <w:lang w:val="en-US" w:eastAsia="ru-RU"/>
+          <w:lang w:eastAsia="ru-RU"/>
         </w:rPr>
         <w:t> </w:t>
       </w:r>
@@ -2527,7 +2626,7 @@
         <w:ind w:left="284" w:right="284" w:firstLine="709"/>
       </w:pPr>
       <w:bookmarkStart w:id="12" w:name="_Toc231592565"/>
-      <w:bookmarkStart w:id="13" w:name="_Toc242696314"/>
+      <w:bookmarkStart w:id="13" w:name="_Toc242780716"/>
       <w:r>
         <w:t>1.3 </w:t>
       </w:r>
@@ -2557,7 +2656,7 @@
         </w:numPr>
         <w:ind w:left="284" w:right="284" w:firstLine="709"/>
       </w:pPr>
-      <w:bookmarkStart w:id="14" w:name="_Toc242696315"/>
+      <w:bookmarkStart w:id="14" w:name="_Toc242780717"/>
       <w:r>
         <w:t>1.4 </w:t>
       </w:r>
@@ -2565,6 +2664,184 @@
         <w:t>Обоснование выбора средств разработки</w:t>
       </w:r>
       <w:bookmarkEnd w:id="14"/>
+    </w:p>
+    <w:p>
+      <w:pPr>
+        <w:tabs>
+          <w:tab w:val="left" w:pos="993"/>
+        </w:tabs>
+        <w:ind w:left="284" w:right="284"/>
+        <w:rPr>
+          <w:lang w:eastAsia="ru-RU"/>
+        </w:rPr>
+      </w:pPr>
+      <w:r>
+        <w:rPr>
+          <w:lang w:eastAsia="ru-RU"/>
+        </w:rPr>
+        <w:t>Для разработки системы комплексного анализа .NET-проектов и связанных баз данных выбран набор технологий, позволяющий реализовать серверную часть, механизмы анализа, хранение результатов и несколько способов взаимодействия с пользователем.</w:t>
+      </w:r>
+    </w:p>
+    <w:p>
+      <w:pPr>
+        <w:tabs>
+          <w:tab w:val="left" w:pos="993"/>
+        </w:tabs>
+        <w:ind w:left="284" w:right="284"/>
+        <w:rPr>
+          <w:lang w:eastAsia="ru-RU"/>
+        </w:rPr>
+      </w:pPr>
+      <w:r>
+        <w:rPr>
+          <w:lang w:eastAsia="ru-RU"/>
+        </w:rPr>
+        <w:t>Основным языком серверной разработки является C#. Он используется для реализации бизнес-логики, анализаторов и компонентов, взаимодействующих с платформой .NET. Для исследования исходного кода C# применяется Roslyn, предоставляющий средства разбора синтаксической и семантической структуры программ. Это позволяет реализовывать проверки по заданным правилам без необходимости запускать анализируемое приложение.</w:t>
+      </w:r>
+    </w:p>
+    <w:p>
+      <w:pPr>
+        <w:tabs>
+          <w:tab w:val="left" w:pos="993"/>
+        </w:tabs>
+        <w:ind w:left="284" w:right="284"/>
+        <w:rPr>
+          <w:lang w:eastAsia="ru-RU"/>
+        </w:rPr>
+      </w:pPr>
+      <w:r>
+        <w:rPr>
+          <w:lang w:eastAsia="ru-RU"/>
+        </w:rPr>
+        <w:t>Серверная часть разрабатывается на ASP.NET Core Web API. Она отвечает за обработку запросов клиентов, запуск анализа и передачу результатов. Взаимодействие между клиентами и сервером организуется через HTTP API с использованием формата JSON. Для документирования и проверки доступных методов API предусмотрен Swagger/OpenAPI.</w:t>
+      </w:r>
+    </w:p>
+    <w:p>
+      <w:pPr>
+        <w:tabs>
+          <w:tab w:val="left" w:pos="993"/>
+        </w:tabs>
+        <w:ind w:left="284" w:right="284"/>
+        <w:rPr>
+          <w:lang w:eastAsia="ru-RU"/>
+        </w:rPr>
+      </w:pPr>
+      <w:r>
+        <w:rPr>
+          <w:lang w:eastAsia="ru-RU"/>
+        </w:rPr>
+        <w:t xml:space="preserve">Для хранения сведений о пользователях, проектах, запусках анализа и найденных проблемах используется PostgreSQL. Доступ к базе данных реализуется с помощью Entity Framework Core, который позволяет работать </w:t>
+      </w:r>
+      <w:r>
+        <w:rPr>
+          <w:lang w:eastAsia="ru-RU"/>
+        </w:rPr>
+        <w:lastRenderedPageBreak/>
+        <w:t>с данными через объектную модель и управлять изменениями структуры базы посредством миграций.</w:t>
+      </w:r>
+    </w:p>
+    <w:p>
+      <w:pPr>
+        <w:tabs>
+          <w:tab w:val="left" w:pos="993"/>
+        </w:tabs>
+        <w:ind w:left="284" w:right="284"/>
+        <w:rPr>
+          <w:lang w:eastAsia="ru-RU"/>
+        </w:rPr>
+      </w:pPr>
+      <w:r>
+        <w:rPr>
+          <w:lang w:eastAsia="ru-RU"/>
+        </w:rPr>
+        <w:t>Анализ структуры базы данных выполняется на основе сведений о схеме PostgreSQL, метаданных Entity Framework Core и собственных правил проверки. Для исследования взаимодействия приложения с базой данных предусматривается перехват SQL-запросов, выполняемых через Entity Framework Core. Это позволит искать повторяющиеся обращения, избыточные запросы и потенциальные случаи возникновения проблемы N+1.</w:t>
+      </w:r>
+    </w:p>
+    <w:p>
+      <w:pPr>
+        <w:tabs>
+          <w:tab w:val="left" w:pos="993"/>
+        </w:tabs>
+        <w:ind w:left="284" w:right="284"/>
+        <w:rPr>
+          <w:lang w:eastAsia="ru-RU"/>
+        </w:rPr>
+      </w:pPr>
+      <w:r>
+        <w:rPr>
+          <w:lang w:eastAsia="ru-RU"/>
+        </w:rPr>
+        <w:t>Для получения сведений об исходных проектах предусмотрена интеграция с GitHub REST API. Она позволит получать информацию о подключённых репозиториях и использовать их содержимое для последующего анализа. Выполнение длительных операций планируется организовать с помощью фоновых служб ASP.NET Core.</w:t>
+      </w:r>
+    </w:p>
+    <w:p>
+      <w:pPr>
+        <w:tabs>
+          <w:tab w:val="left" w:pos="993"/>
+        </w:tabs>
+        <w:ind w:left="284" w:right="284"/>
+        <w:rPr>
+          <w:lang w:eastAsia="ru-RU"/>
+        </w:rPr>
+      </w:pPr>
+      <w:r>
+        <w:rPr>
+          <w:lang w:eastAsia="ru-RU"/>
+        </w:rPr>
+        <w:t>Пользовательский доступ к системе предусматривается через несколько клиентов. Графический интерфейс разрабатывается с использованием Tauri, React и TypeScript. Для автоматизации запуска проверок предназначен консольный клиент на платформе .NET. Дополнительно предусматривается чат-бот, позволяющий выполнять отдельные операции и получать уведомления о результатах анализа.</w:t>
+      </w:r>
+    </w:p>
+    <w:p>
+      <w:pPr>
+        <w:tabs>
+          <w:tab w:val="left" w:pos="993"/>
+        </w:tabs>
+        <w:ind w:left="284" w:right="284"/>
+        <w:rPr>
+          <w:lang w:eastAsia="ru-RU"/>
+        </w:rPr>
+      </w:pPr>
+      <w:r>
+        <w:rPr>
+          <w:lang w:eastAsia="ru-RU"/>
+        </w:rPr>
+        <w:t>Для защиты доступа к серверной части предусмотрена аутентификация с использованием JWT и механизма обновления токенов. Хранение учётных данных должно выполняться с применением средств безопасного хранения паролей, например ASP.NET Core Identity.</w:t>
+      </w:r>
+    </w:p>
+    <w:p>
+      <w:pPr>
+        <w:tabs>
+          <w:tab w:val="left" w:pos="993"/>
+        </w:tabs>
+        <w:ind w:left="284" w:right="284"/>
+        <w:rPr>
+          <w:lang w:eastAsia="ru-RU"/>
+        </w:rPr>
+      </w:pPr>
+      <w:r>
+        <w:rPr>
+          <w:lang w:eastAsia="ru-RU"/>
+        </w:rPr>
+        <w:t>Для упрощения развёртывания и обеспечения единого окружения используется Docker Compose. Журналирование работы приложения планируется реализовать с помощью Serilog. Для проверки отдельных компонентов и анализаторов предусматривается xUnit, а автоматическую сборку и запуск тестов в процессе разработки можно организовать через GitHub Actions.</w:t>
+      </w:r>
+    </w:p>
+    <w:p>
+      <w:pPr>
+        <w:tabs>
+          <w:tab w:val="left" w:pos="993"/>
+        </w:tabs>
+        <w:ind w:left="284" w:right="284"/>
+        <w:rPr>
+          <w:lang w:eastAsia="ru-RU"/>
+        </w:rPr>
+      </w:pPr>
+      <w:r>
+        <w:rPr>
+          <w:lang w:eastAsia="ru-RU"/>
+        </w:rPr>
+        <w:lastRenderedPageBreak/>
+        <w:t>Выбранные средства разработки разделяют ответственность между серверной частью, анализаторами, хранилищем данных и клиентскими приложениями. Такое разделение позволит развивать отдельные компоненты независимо и добавлять новые правила анализа без необходимости существенно изменять остальные части системы.</w:t>
+      </w:r>
     </w:p>
     <w:p>
       <w:pPr>
@@ -2594,7 +2871,7 @@
         </w:rPr>
       </w:pPr>
       <w:bookmarkStart w:id="15" w:name="_Toc231592566"/>
-      <w:bookmarkStart w:id="16" w:name="_Toc242696316"/>
+      <w:bookmarkStart w:id="16" w:name="_Toc242780718"/>
       <w:r>
         <w:rPr>
           <w:lang w:eastAsia="ru-RU"/>
@@ -2625,7 +2902,7 @@
         <w:ind w:left="284" w:right="284" w:firstLine="709"/>
       </w:pPr>
       <w:bookmarkStart w:id="17" w:name="_Toc231592567"/>
-      <w:bookmarkStart w:id="18" w:name="_Toc242696317"/>
+      <w:bookmarkStart w:id="18" w:name="_Toc242780719"/>
       <w:r>
         <w:t>2.1 </w:t>
       </w:r>
@@ -2653,7 +2930,7 @@
         <w:ind w:left="284" w:right="284" w:firstLine="709"/>
       </w:pPr>
       <w:bookmarkStart w:id="19" w:name="_Toc231592568"/>
-      <w:bookmarkStart w:id="20" w:name="_Toc242696318"/>
+      <w:bookmarkStart w:id="20" w:name="_Toc242780720"/>
       <w:r>
         <w:t>2.2 </w:t>
       </w:r>
@@ -2686,7 +2963,7 @@
         <w:ind w:left="284" w:right="284" w:firstLine="709"/>
       </w:pPr>
       <w:bookmarkStart w:id="25" w:name="_Toc231592569"/>
-      <w:bookmarkStart w:id="26" w:name="_Toc242696319"/>
+      <w:bookmarkStart w:id="26" w:name="_Toc242780721"/>
       <w:r>
         <w:t>2.3 </w:t>
       </w:r>
@@ -2713,7 +2990,7 @@
         </w:numPr>
         <w:ind w:left="284" w:right="284" w:firstLine="709"/>
       </w:pPr>
-      <w:bookmarkStart w:id="27" w:name="_Toc242696320"/>
+      <w:bookmarkStart w:id="27" w:name="_Toc242780722"/>
       <w:r>
         <w:t>2.4 </w:t>
       </w:r>
@@ -2739,7 +3016,7 @@
         </w:numPr>
         <w:ind w:left="284" w:right="284" w:firstLine="709"/>
       </w:pPr>
-      <w:bookmarkStart w:id="28" w:name="_Toc242696321"/>
+      <w:bookmarkStart w:id="28" w:name="_Toc242780723"/>
       <w:r>
         <w:t>2.5 </w:t>
       </w:r>
@@ -2773,7 +3050,7 @@
         </w:rPr>
       </w:pPr>
       <w:bookmarkStart w:id="29" w:name="_Toc231592571"/>
-      <w:bookmarkStart w:id="30" w:name="_Toc242696322"/>
+      <w:bookmarkStart w:id="30" w:name="_Toc242780724"/>
       <w:r>
         <w:rPr>
           <w:lang w:eastAsia="ru-RU"/>
@@ -2807,7 +3084,7 @@
         </w:rPr>
       </w:pPr>
       <w:bookmarkStart w:id="31" w:name="_Toc231592572"/>
-      <w:bookmarkStart w:id="32" w:name="_Toc242696323"/>
+      <w:bookmarkStart w:id="32" w:name="_Toc242780725"/>
       <w:r>
         <w:rPr>
           <w:lang w:eastAsia="ru-RU"/>
@@ -2841,7 +3118,7 @@
         <w:ind w:left="284" w:right="284" w:firstLine="709"/>
       </w:pPr>
       <w:bookmarkStart w:id="33" w:name="_Toc231592573"/>
-      <w:bookmarkStart w:id="34" w:name="_Toc242696324"/>
+      <w:bookmarkStart w:id="34" w:name="_Toc242780726"/>
       <w:r>
         <w:t>4.1 </w:t>
       </w:r>
@@ -2875,7 +3152,7 @@
         <w:ind w:left="284" w:right="284" w:firstLine="709"/>
       </w:pPr>
       <w:bookmarkStart w:id="35" w:name="_Toc231592574"/>
-      <w:bookmarkStart w:id="36" w:name="_Toc242696325"/>
+      <w:bookmarkStart w:id="36" w:name="_Toc242780727"/>
       <w:r>
         <w:t>4.2 </w:t>
       </w:r>
@@ -2902,7 +3179,7 @@
         </w:rPr>
       </w:pPr>
       <w:bookmarkStart w:id="37" w:name="_Toc231592575"/>
-      <w:bookmarkStart w:id="38" w:name="_Toc242696326"/>
+      <w:bookmarkStart w:id="38" w:name="_Toc242780728"/>
       <w:r>
         <w:rPr>
           <w:lang w:eastAsia="ru-RU"/>
@@ -2929,7 +3206,7 @@
         </w:rPr>
       </w:pPr>
       <w:bookmarkStart w:id="39" w:name="_Toc231592576"/>
-      <w:bookmarkStart w:id="40" w:name="_Toc242696327"/>
+      <w:bookmarkStart w:id="40" w:name="_Toc242780729"/>
       <w:r>
         <w:rPr>
           <w:lang w:eastAsia="ru-RU"/>
@@ -3473,13 +3750,23 @@
                                       <w:sz w:val="17"/>
                                     </w:rPr>
                                   </w:pPr>
+                                  <w:proofErr w:type="spellStart"/>
                                   <w:r>
                                     <w:rPr>
                                       <w:rFonts w:ascii="Times New Roman" w:hAnsi="Times New Roman" w:cs="Times New Roman"/>
                                       <w:iCs/>
                                       <w:sz w:val="17"/>
                                     </w:rPr>
-                                    <w:t>Изм.</w:t>
+                                    <w:t>Изм</w:t>
+                                  </w:r>
+                                  <w:proofErr w:type="spellEnd"/>
+                                  <w:r>
+                                    <w:rPr>
+                                      <w:rFonts w:ascii="Times New Roman" w:hAnsi="Times New Roman" w:cs="Times New Roman"/>
+                                      <w:iCs/>
+                                      <w:sz w:val="17"/>
+                                    </w:rPr>
+                                    <w:t>.</w:t>
                                   </w:r>
                                 </w:p>
                               </w:tc>
@@ -3541,8 +3828,18 @@
                                       <w:iCs/>
                                       <w:sz w:val="17"/>
                                     </w:rPr>
-                                    <w:t>№ докум</w:t>
+                                    <w:t xml:space="preserve">№ </w:t>
                                   </w:r>
+                                  <w:proofErr w:type="spellStart"/>
+                                  <w:r>
+                                    <w:rPr>
+                                      <w:rFonts w:ascii="Times New Roman" w:hAnsi="Times New Roman" w:cs="Times New Roman"/>
+                                      <w:iCs/>
+                                      <w:sz w:val="17"/>
+                                    </w:rPr>
+                                    <w:t>докум</w:t>
+                                  </w:r>
+                                  <w:proofErr w:type="spellEnd"/>
                                 </w:p>
                               </w:tc>
                               <w:tc>
@@ -3566,6 +3863,7 @@
                                       <w:sz w:val="17"/>
                                     </w:rPr>
                                   </w:pPr>
+                                  <w:proofErr w:type="spellStart"/>
                                   <w:r>
                                     <w:rPr>
                                       <w:rFonts w:ascii="Times New Roman" w:hAnsi="Times New Roman" w:cs="Times New Roman"/>
@@ -3574,6 +3872,7 @@
                                     </w:rPr>
                                     <w:t>Подпись</w:t>
                                   </w:r>
+                                  <w:proofErr w:type="spellEnd"/>
                                 </w:p>
                               </w:tc>
                               <w:tc>
@@ -3656,6 +3955,7 @@
                                       <w:sz w:val="17"/>
                                     </w:rPr>
                                   </w:pPr>
+                                  <w:proofErr w:type="spellStart"/>
                                   <w:r>
                                     <w:rPr>
                                       <w:rFonts w:ascii="Times New Roman" w:hAnsi="Times New Roman" w:cs="Times New Roman"/>
@@ -3663,6 +3963,7 @@
                                     </w:rPr>
                                     <w:t>Разраб</w:t>
                                   </w:r>
+                                  <w:proofErr w:type="spellEnd"/>
                                 </w:p>
                               </w:tc>
                               <w:tc>
@@ -3805,6 +4106,7 @@
                                       <w:lang w:val="ru-RU"/>
                                     </w:rPr>
                                   </w:pPr>
+                                  <w:proofErr w:type="spellStart"/>
                                   <w:r>
                                     <w:rPr>
                                       <w:rFonts w:ascii="Times New Roman" w:hAnsi="Times New Roman" w:cs="Times New Roman"/>
@@ -3813,6 +4115,7 @@
                                     </w:rPr>
                                     <w:t>Лит</w:t>
                                   </w:r>
+                                  <w:proofErr w:type="spellEnd"/>
                                   <w:r>
                                     <w:rPr>
                                       <w:rFonts w:ascii="Times New Roman" w:hAnsi="Times New Roman" w:cs="Times New Roman"/>
@@ -3944,13 +4247,23 @@
                                       <w:lang w:val="ru-RU"/>
                                     </w:rPr>
                                   </w:pPr>
+                                  <w:proofErr w:type="spellStart"/>
                                   <w:r>
                                     <w:rPr>
                                       <w:rFonts w:ascii="Times New Roman" w:hAnsi="Times New Roman" w:cs="Times New Roman"/>
                                       <w:sz w:val="16"/>
                                       <w:lang w:val="ru-RU"/>
                                     </w:rPr>
-                                    <w:t>Нищерикова Л.А.</w:t>
+                                    <w:t>Нищерикова</w:t>
+                                  </w:r>
+                                  <w:proofErr w:type="spellEnd"/>
+                                  <w:r>
+                                    <w:rPr>
+                                      <w:rFonts w:ascii="Times New Roman" w:hAnsi="Times New Roman" w:cs="Times New Roman"/>
+                                      <w:sz w:val="16"/>
+                                      <w:lang w:val="ru-RU"/>
+                                    </w:rPr>
+                                    <w:t xml:space="preserve"> Л.А.</w:t>
                                   </w:r>
                                   <w:r>
                                     <w:rPr>
@@ -4430,13 +4743,23 @@
                                       <w:lang w:val="ru-RU"/>
                                     </w:rPr>
                                   </w:pPr>
+                                  <w:proofErr w:type="spellStart"/>
                                   <w:r>
                                     <w:rPr>
                                       <w:rFonts w:ascii="Times New Roman" w:hAnsi="Times New Roman" w:cs="Times New Roman"/>
                                       <w:sz w:val="16"/>
                                       <w:lang w:val="ru-RU"/>
                                     </w:rPr>
-                                    <w:t>Нищерикова Л.А.</w:t>
+                                    <w:t>Нищерикова</w:t>
+                                  </w:r>
+                                  <w:proofErr w:type="spellEnd"/>
+                                  <w:r>
+                                    <w:rPr>
+                                      <w:rFonts w:ascii="Times New Roman" w:hAnsi="Times New Roman" w:cs="Times New Roman"/>
+                                      <w:sz w:val="16"/>
+                                      <w:lang w:val="ru-RU"/>
+                                    </w:rPr>
+                                    <w:t xml:space="preserve"> Л.А.</w:t>
                                   </w:r>
                                 </w:p>
                               </w:tc>
@@ -4551,6 +4874,7 @@
                                       <w:lang w:val="ru-RU"/>
                                     </w:rPr>
                                   </w:pPr>
+                                  <w:proofErr w:type="spellStart"/>
                                   <w:r>
                                     <w:rPr>
                                       <w:rFonts w:ascii="Times New Roman" w:hAnsi="Times New Roman" w:cs="Times New Roman"/>
@@ -4558,6 +4882,7 @@
                                     </w:rPr>
                                     <w:t>Ут</w:t>
                                   </w:r>
+                                  <w:proofErr w:type="spellEnd"/>
                                   <w:r>
                                     <w:rPr>
                                       <w:rFonts w:ascii="Times New Roman" w:hAnsi="Times New Roman" w:cs="Times New Roman"/>
@@ -5225,13 +5550,23 @@
                                 <w:sz w:val="17"/>
                               </w:rPr>
                             </w:pPr>
+                            <w:proofErr w:type="spellStart"/>
                             <w:r>
                               <w:rPr>
                                 <w:rFonts w:ascii="Times New Roman" w:hAnsi="Times New Roman" w:cs="Times New Roman"/>
                                 <w:iCs/>
                                 <w:sz w:val="17"/>
                               </w:rPr>
-                              <w:t>Изм.</w:t>
+                              <w:t>Изм</w:t>
+                            </w:r>
+                            <w:proofErr w:type="spellEnd"/>
+                            <w:r>
+                              <w:rPr>
+                                <w:rFonts w:ascii="Times New Roman" w:hAnsi="Times New Roman" w:cs="Times New Roman"/>
+                                <w:iCs/>
+                                <w:sz w:val="17"/>
+                              </w:rPr>
+                              <w:t>.</w:t>
                             </w:r>
                           </w:p>
                         </w:tc>
@@ -5293,8 +5628,18 @@
                                 <w:iCs/>
                                 <w:sz w:val="17"/>
                               </w:rPr>
-                              <w:t>№ докум</w:t>
+                              <w:t xml:space="preserve">№ </w:t>
                             </w:r>
+                            <w:proofErr w:type="spellStart"/>
+                            <w:r>
+                              <w:rPr>
+                                <w:rFonts w:ascii="Times New Roman" w:hAnsi="Times New Roman" w:cs="Times New Roman"/>
+                                <w:iCs/>
+                                <w:sz w:val="17"/>
+                              </w:rPr>
+                              <w:t>докум</w:t>
+                            </w:r>
+                            <w:proofErr w:type="spellEnd"/>
                           </w:p>
                         </w:tc>
                         <w:tc>
@@ -5318,6 +5663,7 @@
                                 <w:sz w:val="17"/>
                               </w:rPr>
                             </w:pPr>
+                            <w:proofErr w:type="spellStart"/>
                             <w:r>
                               <w:rPr>
                                 <w:rFonts w:ascii="Times New Roman" w:hAnsi="Times New Roman" w:cs="Times New Roman"/>
@@ -5326,6 +5672,7 @@
                               </w:rPr>
                               <w:t>Подпись</w:t>
                             </w:r>
+                            <w:proofErr w:type="spellEnd"/>
                           </w:p>
                         </w:tc>
                         <w:tc>
@@ -5408,6 +5755,7 @@
                                 <w:sz w:val="17"/>
                               </w:rPr>
                             </w:pPr>
+                            <w:proofErr w:type="spellStart"/>
                             <w:r>
                               <w:rPr>
                                 <w:rFonts w:ascii="Times New Roman" w:hAnsi="Times New Roman" w:cs="Times New Roman"/>
@@ -5415,6 +5763,7 @@
                               </w:rPr>
                               <w:t>Разраб</w:t>
                             </w:r>
+                            <w:proofErr w:type="spellEnd"/>
                           </w:p>
                         </w:tc>
                         <w:tc>
@@ -5557,6 +5906,7 @@
                                 <w:lang w:val="ru-RU"/>
                               </w:rPr>
                             </w:pPr>
+                            <w:proofErr w:type="spellStart"/>
                             <w:r>
                               <w:rPr>
                                 <w:rFonts w:ascii="Times New Roman" w:hAnsi="Times New Roman" w:cs="Times New Roman"/>
@@ -5565,6 +5915,7 @@
                               </w:rPr>
                               <w:t>Лит</w:t>
                             </w:r>
+                            <w:proofErr w:type="spellEnd"/>
                             <w:r>
                               <w:rPr>
                                 <w:rFonts w:ascii="Times New Roman" w:hAnsi="Times New Roman" w:cs="Times New Roman"/>
@@ -5696,13 +6047,23 @@
                                 <w:lang w:val="ru-RU"/>
                               </w:rPr>
                             </w:pPr>
+                            <w:proofErr w:type="spellStart"/>
                             <w:r>
                               <w:rPr>
                                 <w:rFonts w:ascii="Times New Roman" w:hAnsi="Times New Roman" w:cs="Times New Roman"/>
                                 <w:sz w:val="16"/>
                                 <w:lang w:val="ru-RU"/>
                               </w:rPr>
-                              <w:t>Нищерикова Л.А.</w:t>
+                              <w:t>Нищерикова</w:t>
+                            </w:r>
+                            <w:proofErr w:type="spellEnd"/>
+                            <w:r>
+                              <w:rPr>
+                                <w:rFonts w:ascii="Times New Roman" w:hAnsi="Times New Roman" w:cs="Times New Roman"/>
+                                <w:sz w:val="16"/>
+                                <w:lang w:val="ru-RU"/>
+                              </w:rPr>
+                              <w:t xml:space="preserve"> Л.А.</w:t>
                             </w:r>
                             <w:r>
                               <w:rPr>
@@ -6182,13 +6543,23 @@
                                 <w:lang w:val="ru-RU"/>
                               </w:rPr>
                             </w:pPr>
+                            <w:proofErr w:type="spellStart"/>
                             <w:r>
                               <w:rPr>
                                 <w:rFonts w:ascii="Times New Roman" w:hAnsi="Times New Roman" w:cs="Times New Roman"/>
                                 <w:sz w:val="16"/>
                                 <w:lang w:val="ru-RU"/>
                               </w:rPr>
-                              <w:t>Нищерикова Л.А.</w:t>
+                              <w:t>Нищерикова</w:t>
+                            </w:r>
+                            <w:proofErr w:type="spellEnd"/>
+                            <w:r>
+                              <w:rPr>
+                                <w:rFonts w:ascii="Times New Roman" w:hAnsi="Times New Roman" w:cs="Times New Roman"/>
+                                <w:sz w:val="16"/>
+                                <w:lang w:val="ru-RU"/>
+                              </w:rPr>
+                              <w:t xml:space="preserve"> Л.А.</w:t>
                             </w:r>
                           </w:p>
                         </w:tc>
@@ -6303,6 +6674,7 @@
                                 <w:lang w:val="ru-RU"/>
                               </w:rPr>
                             </w:pPr>
+                            <w:proofErr w:type="spellStart"/>
                             <w:r>
                               <w:rPr>
                                 <w:rFonts w:ascii="Times New Roman" w:hAnsi="Times New Roman" w:cs="Times New Roman"/>
@@ -6310,6 +6682,7 @@
                               </w:rPr>
                               <w:t>Ут</w:t>
                             </w:r>
+                            <w:proofErr w:type="spellEnd"/>
                             <w:r>
                               <w:rPr>
                                 <w:rFonts w:ascii="Times New Roman" w:hAnsi="Times New Roman" w:cs="Times New Roman"/>
@@ -7315,13 +7688,23 @@
                                       <w:sz w:val="17"/>
                                     </w:rPr>
                                   </w:pPr>
+                                  <w:proofErr w:type="spellStart"/>
                                   <w:r>
                                     <w:rPr>
                                       <w:rFonts w:ascii="Times New Roman" w:hAnsi="Times New Roman"/>
                                       <w:iCs/>
                                       <w:sz w:val="17"/>
                                     </w:rPr>
-                                    <w:t>Изм.</w:t>
+                                    <w:t>Изм</w:t>
+                                  </w:r>
+                                  <w:proofErr w:type="spellEnd"/>
+                                  <w:r>
+                                    <w:rPr>
+                                      <w:rFonts w:ascii="Times New Roman" w:hAnsi="Times New Roman"/>
+                                      <w:iCs/>
+                                      <w:sz w:val="17"/>
+                                    </w:rPr>
+                                    <w:t>.</w:t>
                                   </w:r>
                                 </w:p>
                               </w:tc>
@@ -7383,8 +7766,18 @@
                                       <w:iCs/>
                                       <w:sz w:val="17"/>
                                     </w:rPr>
-                                    <w:t>№ докум</w:t>
+                                    <w:t xml:space="preserve">№ </w:t>
                                   </w:r>
+                                  <w:proofErr w:type="spellStart"/>
+                                  <w:r>
+                                    <w:rPr>
+                                      <w:rFonts w:ascii="Times New Roman" w:hAnsi="Times New Roman"/>
+                                      <w:iCs/>
+                                      <w:sz w:val="17"/>
+                                    </w:rPr>
+                                    <w:t>докум</w:t>
+                                  </w:r>
+                                  <w:proofErr w:type="spellEnd"/>
                                 </w:p>
                               </w:tc>
                               <w:tc>
@@ -7408,6 +7801,7 @@
                                       <w:sz w:val="17"/>
                                     </w:rPr>
                                   </w:pPr>
+                                  <w:proofErr w:type="spellStart"/>
                                   <w:r>
                                     <w:rPr>
                                       <w:rFonts w:ascii="Times New Roman" w:hAnsi="Times New Roman"/>
@@ -7416,6 +7810,7 @@
                                     </w:rPr>
                                     <w:t>Подпись</w:t>
                                   </w:r>
+                                  <w:proofErr w:type="spellEnd"/>
                                 </w:p>
                               </w:tc>
                               <w:tc>
@@ -7981,13 +8376,23 @@
                                 <w:sz w:val="17"/>
                               </w:rPr>
                             </w:pPr>
+                            <w:proofErr w:type="spellStart"/>
                             <w:r>
                               <w:rPr>
                                 <w:rFonts w:ascii="Times New Roman" w:hAnsi="Times New Roman"/>
                                 <w:iCs/>
                                 <w:sz w:val="17"/>
                               </w:rPr>
-                              <w:t>Изм.</w:t>
+                              <w:t>Изм</w:t>
+                            </w:r>
+                            <w:proofErr w:type="spellEnd"/>
+                            <w:r>
+                              <w:rPr>
+                                <w:rFonts w:ascii="Times New Roman" w:hAnsi="Times New Roman"/>
+                                <w:iCs/>
+                                <w:sz w:val="17"/>
+                              </w:rPr>
+                              <w:t>.</w:t>
                             </w:r>
                           </w:p>
                         </w:tc>
@@ -8049,8 +8454,18 @@
                                 <w:iCs/>
                                 <w:sz w:val="17"/>
                               </w:rPr>
-                              <w:t>№ докум</w:t>
+                              <w:t xml:space="preserve">№ </w:t>
                             </w:r>
+                            <w:proofErr w:type="spellStart"/>
+                            <w:r>
+                              <w:rPr>
+                                <w:rFonts w:ascii="Times New Roman" w:hAnsi="Times New Roman"/>
+                                <w:iCs/>
+                                <w:sz w:val="17"/>
+                              </w:rPr>
+                              <w:t>докум</w:t>
+                            </w:r>
+                            <w:proofErr w:type="spellEnd"/>
                           </w:p>
                         </w:tc>
                         <w:tc>
@@ -8074,6 +8489,7 @@
                                 <w:sz w:val="17"/>
                               </w:rPr>
                             </w:pPr>
+                            <w:proofErr w:type="spellStart"/>
                             <w:r>
                               <w:rPr>
                                 <w:rFonts w:ascii="Times New Roman" w:hAnsi="Times New Roman"/>
@@ -8082,6 +8498,7 @@
                               </w:rPr>
                               <w:t>Подпись</w:t>
                             </w:r>
+                            <w:proofErr w:type="spellEnd"/>
                           </w:p>
                         </w:tc>
                         <w:tc>
@@ -9662,6 +10079,144 @@
     </w:lvl>
   </w:abstractNum>
   <w:abstractNum w:abstractNumId="14" w15:restartNumberingAfterBreak="0">
+    <w:nsid w:val="49C72992"/>
+    <w:multiLevelType w:val="multilevel"/>
+    <w:tmpl w:val="67021878"/>
+    <w:lvl w:ilvl="0">
+      <w:start w:val="1"/>
+      <w:numFmt w:val="decimal"/>
+      <w:suff w:val="space"/>
+      <w:lvlText w:val="%1."/>
+      <w:lvlJc w:val="left"/>
+      <w:pPr>
+        <w:ind w:left="0" w:firstLine="709"/>
+      </w:pPr>
+      <w:rPr>
+        <w:rFonts w:hint="default"/>
+      </w:rPr>
+    </w:lvl>
+    <w:lvl w:ilvl="1">
+      <w:start w:val="1"/>
+      <w:numFmt w:val="decimal"/>
+      <w:lvlText w:val="%2."/>
+      <w:lvlJc w:val="left"/>
+      <w:pPr>
+        <w:tabs>
+          <w:tab w:val="num" w:pos="1440"/>
+        </w:tabs>
+        <w:ind w:left="1440" w:hanging="360"/>
+      </w:pPr>
+      <w:rPr>
+        <w:rFonts w:hint="default"/>
+      </w:rPr>
+    </w:lvl>
+    <w:lvl w:ilvl="2">
+      <w:start w:val="1"/>
+      <w:numFmt w:val="decimal"/>
+      <w:lvlText w:val="%3."/>
+      <w:lvlJc w:val="left"/>
+      <w:pPr>
+        <w:tabs>
+          <w:tab w:val="num" w:pos="2160"/>
+        </w:tabs>
+        <w:ind w:left="2160" w:hanging="360"/>
+      </w:pPr>
+      <w:rPr>
+        <w:rFonts w:hint="default"/>
+      </w:rPr>
+    </w:lvl>
+    <w:lvl w:ilvl="3">
+      <w:start w:val="1"/>
+      <w:numFmt w:val="decimal"/>
+      <w:lvlText w:val="%4."/>
+      <w:lvlJc w:val="left"/>
+      <w:pPr>
+        <w:tabs>
+          <w:tab w:val="num" w:pos="2880"/>
+        </w:tabs>
+        <w:ind w:left="2880" w:hanging="360"/>
+      </w:pPr>
+      <w:rPr>
+        <w:rFonts w:hint="default"/>
+      </w:rPr>
+    </w:lvl>
+    <w:lvl w:ilvl="4">
+      <w:start w:val="1"/>
+      <w:numFmt w:val="decimal"/>
+      <w:lvlText w:val="%5."/>
+      <w:lvlJc w:val="left"/>
+      <w:pPr>
+        <w:tabs>
+          <w:tab w:val="num" w:pos="3600"/>
+        </w:tabs>
+        <w:ind w:left="3600" w:hanging="360"/>
+      </w:pPr>
+      <w:rPr>
+        <w:rFonts w:hint="default"/>
+      </w:rPr>
+    </w:lvl>
+    <w:lvl w:ilvl="5">
+      <w:start w:val="1"/>
+      <w:numFmt w:val="decimal"/>
+      <w:lvlText w:val="%6."/>
+      <w:lvlJc w:val="left"/>
+      <w:pPr>
+        <w:tabs>
+          <w:tab w:val="num" w:pos="4320"/>
+        </w:tabs>
+        <w:ind w:left="4320" w:hanging="360"/>
+      </w:pPr>
+      <w:rPr>
+        <w:rFonts w:hint="default"/>
+      </w:rPr>
+    </w:lvl>
+    <w:lvl w:ilvl="6">
+      <w:start w:val="1"/>
+      <w:numFmt w:val="decimal"/>
+      <w:lvlText w:val="%7."/>
+      <w:lvlJc w:val="left"/>
+      <w:pPr>
+        <w:tabs>
+          <w:tab w:val="num" w:pos="5040"/>
+        </w:tabs>
+        <w:ind w:left="5040" w:hanging="360"/>
+      </w:pPr>
+      <w:rPr>
+        <w:rFonts w:hint="default"/>
+      </w:rPr>
+    </w:lvl>
+    <w:lvl w:ilvl="7">
+      <w:start w:val="1"/>
+      <w:numFmt w:val="decimal"/>
+      <w:lvlText w:val="%8."/>
+      <w:lvlJc w:val="left"/>
+      <w:pPr>
+        <w:tabs>
+          <w:tab w:val="num" w:pos="5760"/>
+        </w:tabs>
+        <w:ind w:left="5760" w:hanging="360"/>
+      </w:pPr>
+      <w:rPr>
+        <w:rFonts w:hint="default"/>
+      </w:rPr>
+    </w:lvl>
+    <w:lvl w:ilvl="8">
+      <w:start w:val="1"/>
+      <w:numFmt w:val="decimal"/>
+      <w:lvlText w:val="%9."/>
+      <w:lvlJc w:val="left"/>
+      <w:pPr>
+        <w:tabs>
+          <w:tab w:val="num" w:pos="6480"/>
+        </w:tabs>
+        <w:ind w:left="6480" w:hanging="360"/>
+      </w:pPr>
+      <w:rPr>
+        <w:rFonts w:hint="default"/>
+      </w:rPr>
+    </w:lvl>
+  </w:abstractNum>
+  <w:abstractNum w:abstractNumId="15" w15:restartNumberingAfterBreak="0">
     <w:nsid w:val="4BCF0D11"/>
     <w:multiLevelType w:val="multilevel"/>
     <w:tmpl w:val="04190025"/>
@@ -9756,7 +10311,7 @@
       </w:pPr>
     </w:lvl>
   </w:abstractNum>
-  <w:abstractNum w:abstractNumId="15" w15:restartNumberingAfterBreak="0">
+  <w:abstractNum w:abstractNumId="16" w15:restartNumberingAfterBreak="0">
     <w:nsid w:val="4E9A208A"/>
     <w:multiLevelType w:val="multilevel"/>
     <w:tmpl w:val="F70AEE96"/>
@@ -9869,7 +10424,7 @@
       </w:rPr>
     </w:lvl>
   </w:abstractNum>
-  <w:abstractNum w:abstractNumId="16" w15:restartNumberingAfterBreak="0">
+  <w:abstractNum w:abstractNumId="17" w15:restartNumberingAfterBreak="0">
     <w:nsid w:val="4F4F4572"/>
     <w:multiLevelType w:val="multilevel"/>
     <w:tmpl w:val="C718799C"/>
@@ -9982,7 +10537,7 @@
       </w:rPr>
     </w:lvl>
   </w:abstractNum>
-  <w:abstractNum w:abstractNumId="17" w15:restartNumberingAfterBreak="0">
+  <w:abstractNum w:abstractNumId="18" w15:restartNumberingAfterBreak="0">
     <w:nsid w:val="559E59FB"/>
     <w:multiLevelType w:val="multilevel"/>
     <w:tmpl w:val="8A00B244"/>
@@ -10095,7 +10650,7 @@
       </w:rPr>
     </w:lvl>
   </w:abstractNum>
-  <w:abstractNum w:abstractNumId="18" w15:restartNumberingAfterBreak="0">
+  <w:abstractNum w:abstractNumId="19" w15:restartNumberingAfterBreak="0">
     <w:nsid w:val="60002644"/>
     <w:multiLevelType w:val="multilevel"/>
     <w:tmpl w:val="F1562A24"/>
@@ -10208,7 +10763,7 @@
       </w:rPr>
     </w:lvl>
   </w:abstractNum>
-  <w:abstractNum w:abstractNumId="19" w15:restartNumberingAfterBreak="0">
+  <w:abstractNum w:abstractNumId="20" w15:restartNumberingAfterBreak="0">
     <w:nsid w:val="608A53F6"/>
     <w:multiLevelType w:val="hybridMultilevel"/>
     <w:tmpl w:val="FD901EAA"/>
@@ -10321,7 +10876,7 @@
       </w:rPr>
     </w:lvl>
   </w:abstractNum>
-  <w:abstractNum w:abstractNumId="20" w15:restartNumberingAfterBreak="0">
+  <w:abstractNum w:abstractNumId="21" w15:restartNumberingAfterBreak="0">
     <w:nsid w:val="627C79C2"/>
     <w:multiLevelType w:val="hybridMultilevel"/>
     <w:tmpl w:val="D7C66BC4"/>
@@ -10410,7 +10965,7 @@
       </w:pPr>
     </w:lvl>
   </w:abstractNum>
-  <w:abstractNum w:abstractNumId="21" w15:restartNumberingAfterBreak="0">
+  <w:abstractNum w:abstractNumId="22" w15:restartNumberingAfterBreak="0">
     <w:nsid w:val="6BAC7B3A"/>
     <w:multiLevelType w:val="hybridMultilevel"/>
     <w:tmpl w:val="44943FDC"/>
@@ -10523,7 +11078,7 @@
       </w:rPr>
     </w:lvl>
   </w:abstractNum>
-  <w:abstractNum w:abstractNumId="22" w15:restartNumberingAfterBreak="0">
+  <w:abstractNum w:abstractNumId="23" w15:restartNumberingAfterBreak="0">
     <w:nsid w:val="6C1E0575"/>
     <w:multiLevelType w:val="multilevel"/>
     <w:tmpl w:val="461270B0"/>
@@ -10636,7 +11191,7 @@
       </w:rPr>
     </w:lvl>
   </w:abstractNum>
-  <w:abstractNum w:abstractNumId="23" w15:restartNumberingAfterBreak="0">
+  <w:abstractNum w:abstractNumId="24" w15:restartNumberingAfterBreak="0">
     <w:nsid w:val="71CF6551"/>
     <w:multiLevelType w:val="hybridMultilevel"/>
     <w:tmpl w:val="3528B5E8"/>
@@ -10749,7 +11304,7 @@
       </w:rPr>
     </w:lvl>
   </w:abstractNum>
-  <w:abstractNum w:abstractNumId="24" w15:restartNumberingAfterBreak="0">
+  <w:abstractNum w:abstractNumId="25" w15:restartNumberingAfterBreak="0">
     <w:nsid w:val="75D71C7B"/>
     <w:multiLevelType w:val="hybridMultilevel"/>
     <w:tmpl w:val="D48222EC"/>
@@ -10839,7 +11394,7 @@
       </w:pPr>
     </w:lvl>
   </w:abstractNum>
-  <w:abstractNum w:abstractNumId="25" w15:restartNumberingAfterBreak="0">
+  <w:abstractNum w:abstractNumId="26" w15:restartNumberingAfterBreak="0">
     <w:nsid w:val="7F7C116A"/>
     <w:multiLevelType w:val="multilevel"/>
     <w:tmpl w:val="55FC2B82"/>
@@ -10952,7 +11507,7 @@
       </w:rPr>
     </w:lvl>
   </w:abstractNum>
-  <w:abstractNum w:abstractNumId="26" w15:restartNumberingAfterBreak="0">
+  <w:abstractNum w:abstractNumId="27" w15:restartNumberingAfterBreak="0">
     <w:nsid w:val="7F955486"/>
     <w:multiLevelType w:val="hybridMultilevel"/>
     <w:tmpl w:val="D3A87398"/>
@@ -11072,25 +11627,25 @@
     <w:abstractNumId w:val="10"/>
   </w:num>
   <w:num w:numId="3" w16cid:durableId="3825018">
-    <w:abstractNumId w:val="24"/>
+    <w:abstractNumId w:val="25"/>
   </w:num>
   <w:num w:numId="4" w16cid:durableId="418452957">
-    <w:abstractNumId w:val="25"/>
+    <w:abstractNumId w:val="26"/>
   </w:num>
   <w:num w:numId="5" w16cid:durableId="2084328880">
-    <w:abstractNumId w:val="15"/>
+    <w:abstractNumId w:val="16"/>
   </w:num>
   <w:num w:numId="6" w16cid:durableId="2070105118">
-    <w:abstractNumId w:val="22"/>
+    <w:abstractNumId w:val="23"/>
   </w:num>
   <w:num w:numId="7" w16cid:durableId="940727375">
-    <w:abstractNumId w:val="17"/>
+    <w:abstractNumId w:val="18"/>
   </w:num>
   <w:num w:numId="8" w16cid:durableId="1107432416">
     <w:abstractNumId w:val="12"/>
   </w:num>
   <w:num w:numId="9" w16cid:durableId="1859732604">
-    <w:abstractNumId w:val="18"/>
+    <w:abstractNumId w:val="19"/>
   </w:num>
   <w:num w:numId="10" w16cid:durableId="278532838">
     <w:abstractNumId w:val="2"/>
@@ -11099,7 +11654,7 @@
     <w:abstractNumId w:val="9"/>
   </w:num>
   <w:num w:numId="12" w16cid:durableId="2001273092">
-    <w:abstractNumId w:val="14"/>
+    <w:abstractNumId w:val="15"/>
   </w:num>
   <w:num w:numId="13" w16cid:durableId="140776126">
     <w:abstractNumId w:val="7"/>
@@ -11108,7 +11663,7 @@
     <w:abstractNumId w:val="4"/>
   </w:num>
   <w:num w:numId="15" w16cid:durableId="750126623">
-    <w:abstractNumId w:val="19"/>
+    <w:abstractNumId w:val="20"/>
   </w:num>
   <w:num w:numId="16" w16cid:durableId="777062499">
     <w:abstractNumId w:val="11"/>
@@ -11117,7 +11672,7 @@
     <w:abstractNumId w:val="5"/>
   </w:num>
   <w:num w:numId="18" w16cid:durableId="1429765385">
-    <w:abstractNumId w:val="23"/>
+    <w:abstractNumId w:val="24"/>
   </w:num>
   <w:num w:numId="19" w16cid:durableId="2016181849">
     <w:abstractNumId w:val="8"/>
@@ -11126,16 +11681,16 @@
     <w:abstractNumId w:val="0"/>
   </w:num>
   <w:num w:numId="21" w16cid:durableId="338893318">
-    <w:abstractNumId w:val="26"/>
+    <w:abstractNumId w:val="27"/>
   </w:num>
   <w:num w:numId="22" w16cid:durableId="1246957127">
-    <w:abstractNumId w:val="21"/>
+    <w:abstractNumId w:val="22"/>
   </w:num>
   <w:num w:numId="23" w16cid:durableId="1789087853">
     <w:abstractNumId w:val="6"/>
   </w:num>
   <w:num w:numId="24" w16cid:durableId="1625622615">
-    <w:abstractNumId w:val="20"/>
+    <w:abstractNumId w:val="21"/>
   </w:num>
   <w:num w:numId="25" w16cid:durableId="377709553">
     <w:abstractNumId w:val="3"/>
@@ -11144,16 +11699,19 @@
     <w:abstractNumId w:val="13"/>
   </w:num>
   <w:num w:numId="27" w16cid:durableId="1509632809">
-    <w:abstractNumId w:val="16"/>
+    <w:abstractNumId w:val="17"/>
   </w:num>
   <w:num w:numId="28" w16cid:durableId="70540578">
-    <w:abstractNumId w:val="14"/>
+    <w:abstractNumId w:val="15"/>
     <w:lvlOverride w:ilvl="0">
       <w:startOverride w:val="2"/>
     </w:lvlOverride>
     <w:lvlOverride w:ilvl="1">
       <w:startOverride w:val="4"/>
     </w:lvlOverride>
+  </w:num>
+  <w:num w:numId="29" w16cid:durableId="692805556">
+    <w:abstractNumId w:val="14"/>
   </w:num>
   <w:numIdMacAtCleanup w:val="23"/>
 </w:numbering>
@@ -11817,7 +12375,6 @@
   <w:style w:type="character" w:default="1" w:styleId="a1">
     <w:name w:val="Default Paragraph Font"/>
     <w:uiPriority w:val="1"/>
-    <w:semiHidden/>
     <w:unhideWhenUsed/>
   </w:style>
   <w:style w:type="table" w:default="1" w:styleId="a2">

</xml_diff>

<commit_message>
docs(coursework): refine technology selection rationale
</commit_message>
<xml_diff>
--- a/docs/Пояснительная записка.docx
+++ b/docs/Пояснительная записка.docx
@@ -2679,7 +2679,7 @@
         <w:rPr>
           <w:lang w:eastAsia="ru-RU"/>
         </w:rPr>
-        <w:t>Для разработки системы комплексного анализа .NET-проектов и связанных баз данных выбран набор технологий, позволяющий реализовать серверную часть, механизмы анализа, хранение результатов и несколько способов взаимодействия с пользователем.</w:t>
+        <w:t>Для разработки системы комплексного анализа .NET-проектов и связанных баз данных выбран набор технологий, позволяющий реализовать серверную часть, механизмы анализа, хранение результатов и несколько способов взаимодействия с пользователем. При выборе средств разработки учитывались совместимость с платформой .NET, возможность разделения системы на независимые компоненты и наличие инструментов для тестирования и сопровождения программного продукта.</w:t>
       </w:r>
     </w:p>
     <w:p>
@@ -2713,7 +2713,14 @@
         <w:rPr>
           <w:lang w:eastAsia="ru-RU"/>
         </w:rPr>
-        <w:t>Серверная часть разрабатывается на ASP.NET Core Web API. Она отвечает за обработку запросов клиентов, запуск анализа и передачу результатов. Взаимодействие между клиентами и сервером организуется через HTTP API с использованием формата JSON. Для документирования и проверки доступных методов API предусмотрен Swagger/OpenAPI.</w:t>
+        <w:t xml:space="preserve">Серверная часть разрабатывается на ASP.NET Core Web API. Она отвечает за обработку запросов клиентов, запуск анализа и передачу результатов. Взаимодействие между клиентами и сервером организуется через HTTP API с использованием формата JSON. Для документирования и проверки доступных методов API предусмотрены Swagger и OpenAPI. Такой </w:t>
+      </w:r>
+      <w:r>
+        <w:rPr>
+          <w:lang w:eastAsia="ru-RU"/>
+        </w:rPr>
+        <w:lastRenderedPageBreak/>
+        <w:t>подход позволяет использовать общую серверную логику независимо от выбранного пользовательского интерфейса.</w:t>
       </w:r>
     </w:p>
     <w:p>
@@ -2730,14 +2737,7 @@
         <w:rPr>
           <w:lang w:eastAsia="ru-RU"/>
         </w:rPr>
-        <w:t xml:space="preserve">Для хранения сведений о пользователях, проектах, запусках анализа и найденных проблемах используется PostgreSQL. Доступ к базе данных реализуется с помощью Entity Framework Core, который позволяет работать </w:t>
-      </w:r>
-      <w:r>
-        <w:rPr>
-          <w:lang w:eastAsia="ru-RU"/>
-        </w:rPr>
-        <w:lastRenderedPageBreak/>
-        <w:t>с данными через объектную модель и управлять изменениями структуры базы посредством миграций.</w:t>
+        <w:t>Для хранения сведений о пользователях, проектах, запусках анализа и найденных проблемах используется PostgreSQL. Данная система управления базами данных поддерживает реляционную модель, ограничения целостности и работу со связанными таблицами. Доступ к базе данных реализуется с помощью Entity Framework Core, который позволяет работать с данными через объектную модель и управлять изменениями структуры базы посредством миграций.</w:t>
       </w:r>
     </w:p>
     <w:p>
@@ -2754,7 +2754,7 @@
         <w:rPr>
           <w:lang w:eastAsia="ru-RU"/>
         </w:rPr>
-        <w:t>Анализ структуры базы данных выполняется на основе сведений о схеме PostgreSQL, метаданных Entity Framework Core и собственных правил проверки. Для исследования взаимодействия приложения с базой данных предусматривается перехват SQL-запросов, выполняемых через Entity Framework Core. Это позволит искать повторяющиеся обращения, избыточные запросы и потенциальные случаи возникновения проблемы N+1.</w:t>
+        <w:t>Анализ структуры базы данных выполняется на основе сведений о схеме PostgreSQL, метаданных Entity Framework Core и собственных правил проверки. Такой подход позволяет проверять структуру таблиц и связей, а также выявлять предусмотренные правилами потенциальные проблемы. Для исследования взаимодействия приложения с базой данных предусматривается перехват SQL-запросов, выполняемых через Entity Framework Core. Это позволит искать повторяющиеся обращения, избыточные запросы и случаи возникновения проблемы N+1.</w:t>
       </w:r>
     </w:p>
     <w:p>
@@ -2771,7 +2771,7 @@
         <w:rPr>
           <w:lang w:eastAsia="ru-RU"/>
         </w:rPr>
-        <w:t>Для получения сведений об исходных проектах предусмотрена интеграция с GitHub REST API. Она позволит получать информацию о подключённых репозиториях и использовать их содержимое для последующего анализа. Выполнение длительных операций планируется организовать с помощью фоновых служб ASP.NET Core.</w:t>
+        <w:t>Для получения сведений об исходных проектах предусмотрена интеграция с GitHub REST API. Она позволит получать информацию о подключённых репозиториях и использовать их содержимое для последующего анализа. Выполнение длительных операций планируется организовать с помощью фоновых служб ASP.NET Core, чтобы запуск проверок не требовал постоянного ожидания со стороны пользователя.</w:t>
       </w:r>
     </w:p>
     <w:p>
@@ -2788,7 +2788,14 @@
         <w:rPr>
           <w:lang w:eastAsia="ru-RU"/>
         </w:rPr>
-        <w:t>Пользовательский доступ к системе предусматривается через несколько клиентов. Графический интерфейс разрабатывается с использованием Tauri, React и TypeScript. Для автоматизации запуска проверок предназначен консольный клиент на платформе .NET. Дополнительно предусматривается чат-бот, позволяющий выполнять отдельные операции и получать уведомления о результатах анализа.</w:t>
+        <w:t xml:space="preserve">Пользовательский доступ к системе предусматривается через несколько клиентов. Графический интерфейс разрабатывается с использованием Tauri, React и TypeScript. Для автоматизации запуска проверок предназначен консольный клиент на платформе .NET. Дополнительно предусматривается чат-бот, позволяющий выполнять отдельные операции и получать уведомления о результатах анализа. </w:t>
+      </w:r>
+      <w:r>
+        <w:rPr>
+          <w:lang w:eastAsia="ru-RU"/>
+        </w:rPr>
+        <w:lastRenderedPageBreak/>
+        <w:t>Использование нескольких интерфейсов позволит выбирать удобный способ работы в зависимости от задачи.</w:t>
       </w:r>
     </w:p>
     <w:p>
@@ -2805,7 +2812,19 @@
         <w:rPr>
           <w:lang w:eastAsia="ru-RU"/>
         </w:rPr>
-        <w:t>Для защиты доступа к серверной части предусмотрена аутентификация с использованием JWT и механизма обновления токенов. Хранение учётных данных должно выполняться с применением средств безопасного хранения паролей, например ASP.NET Core Identity.</w:t>
+        <w:t>Для защиты доступа к серверной части предусмотрена аутентификация с использованием JWT и механизма обновления токенов. Хранение учётных данных должно выполняться с применением средств безопасного хранения паролей, например ASP.NET Core Identity. Для упрощения развёртывания и обеспечения единого окружения используется Docker Compose. Журналирование работы приложения реализова</w:t>
+      </w:r>
+      <w:r>
+        <w:rPr>
+          <w:lang w:eastAsia="ru-RU"/>
+        </w:rPr>
+        <w:t>но</w:t>
+      </w:r>
+      <w:r>
+        <w:rPr>
+          <w:lang w:eastAsia="ru-RU"/>
+        </w:rPr>
+        <w:t xml:space="preserve"> с помощью Serilog, что позволит фиксировать события и ошибки при выполнении операций.</w:t>
       </w:r>
     </w:p>
     <w:p>
@@ -2822,7 +2841,7 @@
         <w:rPr>
           <w:lang w:eastAsia="ru-RU"/>
         </w:rPr>
-        <w:t>Для упрощения развёртывания и обеспечения единого окружения используется Docker Compose. Журналирование работы приложения планируется реализовать с помощью Serilog. Для проверки отдельных компонентов и анализаторов предусматривается xUnit, а автоматическую сборку и запуск тестов в процессе разработки можно организовать через GitHub Actions.</w:t>
+        <w:t>Для проверки отдельных компонентов и анализаторов предусматривается xUnit. Автоматическую сборку и запуск тестов в процессе разработки можно организовать через GitHub Actions. Применение средств тестирования позволит проверять корректность отдельных правил анализа и выявлять ошибки при изменении программного кода.</w:t>
       </w:r>
     </w:p>
     <w:p>
@@ -2839,9 +2858,19 @@
         <w:rPr>
           <w:lang w:eastAsia="ru-RU"/>
         </w:rPr>
-        <w:lastRenderedPageBreak/>
-        <w:t>Выбранные средства разработки разделяют ответственность между серверной частью, анализаторами, хранилищем данных и клиентскими приложениями. Такое разделение позволит развивать отдельные компоненты независимо и добавлять новые правила анализа без необходимости существенно изменять остальные части системы.</w:t>
-      </w:r>
+        <w:t>Выбранные средства разработки разделяют ответственность между серверной частью, анализаторами, хранилищем данных и клиентскими приложениями. Такое разделение позволит развивать отдельные компоненты независимо, упрощать проверку их работоспособности и добавлять новые правила анализа без необходимости существенно изменять остальные части системы.</w:t>
+      </w:r>
+    </w:p>
+    <w:p>
+      <w:pPr>
+        <w:tabs>
+          <w:tab w:val="left" w:pos="993"/>
+        </w:tabs>
+        <w:ind w:left="284" w:right="284"/>
+        <w:rPr>
+          <w:lang w:eastAsia="ru-RU"/>
+        </w:rPr>
+      </w:pPr>
     </w:p>
     <w:p>
       <w:pPr>
@@ -3750,23 +3779,13 @@
                                       <w:sz w:val="17"/>
                                     </w:rPr>
                                   </w:pPr>
-                                  <w:proofErr w:type="spellStart"/>
                                   <w:r>
                                     <w:rPr>
                                       <w:rFonts w:ascii="Times New Roman" w:hAnsi="Times New Roman" w:cs="Times New Roman"/>
                                       <w:iCs/>
                                       <w:sz w:val="17"/>
                                     </w:rPr>
-                                    <w:t>Изм</w:t>
-                                  </w:r>
-                                  <w:proofErr w:type="spellEnd"/>
-                                  <w:r>
-                                    <w:rPr>
-                                      <w:rFonts w:ascii="Times New Roman" w:hAnsi="Times New Roman" w:cs="Times New Roman"/>
-                                      <w:iCs/>
-                                      <w:sz w:val="17"/>
-                                    </w:rPr>
-                                    <w:t>.</w:t>
+                                    <w:t>Изм.</w:t>
                                   </w:r>
                                 </w:p>
                               </w:tc>
@@ -3828,18 +3847,8 @@
                                       <w:iCs/>
                                       <w:sz w:val="17"/>
                                     </w:rPr>
-                                    <w:t xml:space="preserve">№ </w:t>
+                                    <w:t>№ докум</w:t>
                                   </w:r>
-                                  <w:proofErr w:type="spellStart"/>
-                                  <w:r>
-                                    <w:rPr>
-                                      <w:rFonts w:ascii="Times New Roman" w:hAnsi="Times New Roman" w:cs="Times New Roman"/>
-                                      <w:iCs/>
-                                      <w:sz w:val="17"/>
-                                    </w:rPr>
-                                    <w:t>докум</w:t>
-                                  </w:r>
-                                  <w:proofErr w:type="spellEnd"/>
                                 </w:p>
                               </w:tc>
                               <w:tc>
@@ -3863,7 +3872,6 @@
                                       <w:sz w:val="17"/>
                                     </w:rPr>
                                   </w:pPr>
-                                  <w:proofErr w:type="spellStart"/>
                                   <w:r>
                                     <w:rPr>
                                       <w:rFonts w:ascii="Times New Roman" w:hAnsi="Times New Roman" w:cs="Times New Roman"/>
@@ -3872,7 +3880,6 @@
                                     </w:rPr>
                                     <w:t>Подпись</w:t>
                                   </w:r>
-                                  <w:proofErr w:type="spellEnd"/>
                                 </w:p>
                               </w:tc>
                               <w:tc>
@@ -3955,7 +3962,6 @@
                                       <w:sz w:val="17"/>
                                     </w:rPr>
                                   </w:pPr>
-                                  <w:proofErr w:type="spellStart"/>
                                   <w:r>
                                     <w:rPr>
                                       <w:rFonts w:ascii="Times New Roman" w:hAnsi="Times New Roman" w:cs="Times New Roman"/>
@@ -3963,7 +3969,6 @@
                                     </w:rPr>
                                     <w:t>Разраб</w:t>
                                   </w:r>
-                                  <w:proofErr w:type="spellEnd"/>
                                 </w:p>
                               </w:tc>
                               <w:tc>
@@ -4106,7 +4111,6 @@
                                       <w:lang w:val="ru-RU"/>
                                     </w:rPr>
                                   </w:pPr>
-                                  <w:proofErr w:type="spellStart"/>
                                   <w:r>
                                     <w:rPr>
                                       <w:rFonts w:ascii="Times New Roman" w:hAnsi="Times New Roman" w:cs="Times New Roman"/>
@@ -4115,7 +4119,6 @@
                                     </w:rPr>
                                     <w:t>Лит</w:t>
                                   </w:r>
-                                  <w:proofErr w:type="spellEnd"/>
                                   <w:r>
                                     <w:rPr>
                                       <w:rFonts w:ascii="Times New Roman" w:hAnsi="Times New Roman" w:cs="Times New Roman"/>
@@ -4247,23 +4250,13 @@
                                       <w:lang w:val="ru-RU"/>
                                     </w:rPr>
                                   </w:pPr>
-                                  <w:proofErr w:type="spellStart"/>
                                   <w:r>
                                     <w:rPr>
                                       <w:rFonts w:ascii="Times New Roman" w:hAnsi="Times New Roman" w:cs="Times New Roman"/>
                                       <w:sz w:val="16"/>
                                       <w:lang w:val="ru-RU"/>
                                     </w:rPr>
-                                    <w:t>Нищерикова</w:t>
-                                  </w:r>
-                                  <w:proofErr w:type="spellEnd"/>
-                                  <w:r>
-                                    <w:rPr>
-                                      <w:rFonts w:ascii="Times New Roman" w:hAnsi="Times New Roman" w:cs="Times New Roman"/>
-                                      <w:sz w:val="16"/>
-                                      <w:lang w:val="ru-RU"/>
-                                    </w:rPr>
-                                    <w:t xml:space="preserve"> Л.А.</w:t>
+                                    <w:t>Нищерикова Л.А.</w:t>
                                   </w:r>
                                   <w:r>
                                     <w:rPr>
@@ -4743,23 +4736,13 @@
                                       <w:lang w:val="ru-RU"/>
                                     </w:rPr>
                                   </w:pPr>
-                                  <w:proofErr w:type="spellStart"/>
                                   <w:r>
                                     <w:rPr>
                                       <w:rFonts w:ascii="Times New Roman" w:hAnsi="Times New Roman" w:cs="Times New Roman"/>
                                       <w:sz w:val="16"/>
                                       <w:lang w:val="ru-RU"/>
                                     </w:rPr>
-                                    <w:t>Нищерикова</w:t>
-                                  </w:r>
-                                  <w:proofErr w:type="spellEnd"/>
-                                  <w:r>
-                                    <w:rPr>
-                                      <w:rFonts w:ascii="Times New Roman" w:hAnsi="Times New Roman" w:cs="Times New Roman"/>
-                                      <w:sz w:val="16"/>
-                                      <w:lang w:val="ru-RU"/>
-                                    </w:rPr>
-                                    <w:t xml:space="preserve"> Л.А.</w:t>
+                                    <w:t>Нищерикова Л.А.</w:t>
                                   </w:r>
                                 </w:p>
                               </w:tc>
@@ -4874,7 +4857,6 @@
                                       <w:lang w:val="ru-RU"/>
                                     </w:rPr>
                                   </w:pPr>
-                                  <w:proofErr w:type="spellStart"/>
                                   <w:r>
                                     <w:rPr>
                                       <w:rFonts w:ascii="Times New Roman" w:hAnsi="Times New Roman" w:cs="Times New Roman"/>
@@ -4882,7 +4864,6 @@
                                     </w:rPr>
                                     <w:t>Ут</w:t>
                                   </w:r>
-                                  <w:proofErr w:type="spellEnd"/>
                                   <w:r>
                                     <w:rPr>
                                       <w:rFonts w:ascii="Times New Roman" w:hAnsi="Times New Roman" w:cs="Times New Roman"/>
@@ -5550,23 +5531,13 @@
                                 <w:sz w:val="17"/>
                               </w:rPr>
                             </w:pPr>
-                            <w:proofErr w:type="spellStart"/>
                             <w:r>
                               <w:rPr>
                                 <w:rFonts w:ascii="Times New Roman" w:hAnsi="Times New Roman" w:cs="Times New Roman"/>
                                 <w:iCs/>
                                 <w:sz w:val="17"/>
                               </w:rPr>
-                              <w:t>Изм</w:t>
-                            </w:r>
-                            <w:proofErr w:type="spellEnd"/>
-                            <w:r>
-                              <w:rPr>
-                                <w:rFonts w:ascii="Times New Roman" w:hAnsi="Times New Roman" w:cs="Times New Roman"/>
-                                <w:iCs/>
-                                <w:sz w:val="17"/>
-                              </w:rPr>
-                              <w:t>.</w:t>
+                              <w:t>Изм.</w:t>
                             </w:r>
                           </w:p>
                         </w:tc>
@@ -5628,18 +5599,8 @@
                                 <w:iCs/>
                                 <w:sz w:val="17"/>
                               </w:rPr>
-                              <w:t xml:space="preserve">№ </w:t>
+                              <w:t>№ докум</w:t>
                             </w:r>
-                            <w:proofErr w:type="spellStart"/>
-                            <w:r>
-                              <w:rPr>
-                                <w:rFonts w:ascii="Times New Roman" w:hAnsi="Times New Roman" w:cs="Times New Roman"/>
-                                <w:iCs/>
-                                <w:sz w:val="17"/>
-                              </w:rPr>
-                              <w:t>докум</w:t>
-                            </w:r>
-                            <w:proofErr w:type="spellEnd"/>
                           </w:p>
                         </w:tc>
                         <w:tc>
@@ -5663,7 +5624,6 @@
                                 <w:sz w:val="17"/>
                               </w:rPr>
                             </w:pPr>
-                            <w:proofErr w:type="spellStart"/>
                             <w:r>
                               <w:rPr>
                                 <w:rFonts w:ascii="Times New Roman" w:hAnsi="Times New Roman" w:cs="Times New Roman"/>
@@ -5672,7 +5632,6 @@
                               </w:rPr>
                               <w:t>Подпись</w:t>
                             </w:r>
-                            <w:proofErr w:type="spellEnd"/>
                           </w:p>
                         </w:tc>
                         <w:tc>
@@ -5755,7 +5714,6 @@
                                 <w:sz w:val="17"/>
                               </w:rPr>
                             </w:pPr>
-                            <w:proofErr w:type="spellStart"/>
                             <w:r>
                               <w:rPr>
                                 <w:rFonts w:ascii="Times New Roman" w:hAnsi="Times New Roman" w:cs="Times New Roman"/>
@@ -5763,7 +5721,6 @@
                               </w:rPr>
                               <w:t>Разраб</w:t>
                             </w:r>
-                            <w:proofErr w:type="spellEnd"/>
                           </w:p>
                         </w:tc>
                         <w:tc>
@@ -5906,7 +5863,6 @@
                                 <w:lang w:val="ru-RU"/>
                               </w:rPr>
                             </w:pPr>
-                            <w:proofErr w:type="spellStart"/>
                             <w:r>
                               <w:rPr>
                                 <w:rFonts w:ascii="Times New Roman" w:hAnsi="Times New Roman" w:cs="Times New Roman"/>
@@ -5915,7 +5871,6 @@
                               </w:rPr>
                               <w:t>Лит</w:t>
                             </w:r>
-                            <w:proofErr w:type="spellEnd"/>
                             <w:r>
                               <w:rPr>
                                 <w:rFonts w:ascii="Times New Roman" w:hAnsi="Times New Roman" w:cs="Times New Roman"/>
@@ -6047,23 +6002,13 @@
                                 <w:lang w:val="ru-RU"/>
                               </w:rPr>
                             </w:pPr>
-                            <w:proofErr w:type="spellStart"/>
                             <w:r>
                               <w:rPr>
                                 <w:rFonts w:ascii="Times New Roman" w:hAnsi="Times New Roman" w:cs="Times New Roman"/>
                                 <w:sz w:val="16"/>
                                 <w:lang w:val="ru-RU"/>
                               </w:rPr>
-                              <w:t>Нищерикова</w:t>
-                            </w:r>
-                            <w:proofErr w:type="spellEnd"/>
-                            <w:r>
-                              <w:rPr>
-                                <w:rFonts w:ascii="Times New Roman" w:hAnsi="Times New Roman" w:cs="Times New Roman"/>
-                                <w:sz w:val="16"/>
-                                <w:lang w:val="ru-RU"/>
-                              </w:rPr>
-                              <w:t xml:space="preserve"> Л.А.</w:t>
+                              <w:t>Нищерикова Л.А.</w:t>
                             </w:r>
                             <w:r>
                               <w:rPr>
@@ -6543,23 +6488,13 @@
                                 <w:lang w:val="ru-RU"/>
                               </w:rPr>
                             </w:pPr>
-                            <w:proofErr w:type="spellStart"/>
                             <w:r>
                               <w:rPr>
                                 <w:rFonts w:ascii="Times New Roman" w:hAnsi="Times New Roman" w:cs="Times New Roman"/>
                                 <w:sz w:val="16"/>
                                 <w:lang w:val="ru-RU"/>
                               </w:rPr>
-                              <w:t>Нищерикова</w:t>
-                            </w:r>
-                            <w:proofErr w:type="spellEnd"/>
-                            <w:r>
-                              <w:rPr>
-                                <w:rFonts w:ascii="Times New Roman" w:hAnsi="Times New Roman" w:cs="Times New Roman"/>
-                                <w:sz w:val="16"/>
-                                <w:lang w:val="ru-RU"/>
-                              </w:rPr>
-                              <w:t xml:space="preserve"> Л.А.</w:t>
+                              <w:t>Нищерикова Л.А.</w:t>
                             </w:r>
                           </w:p>
                         </w:tc>
@@ -6674,7 +6609,6 @@
                                 <w:lang w:val="ru-RU"/>
                               </w:rPr>
                             </w:pPr>
-                            <w:proofErr w:type="spellStart"/>
                             <w:r>
                               <w:rPr>
                                 <w:rFonts w:ascii="Times New Roman" w:hAnsi="Times New Roman" w:cs="Times New Roman"/>
@@ -6682,7 +6616,6 @@
                               </w:rPr>
                               <w:t>Ут</w:t>
                             </w:r>
-                            <w:proofErr w:type="spellEnd"/>
                             <w:r>
                               <w:rPr>
                                 <w:rFonts w:ascii="Times New Roman" w:hAnsi="Times New Roman" w:cs="Times New Roman"/>
@@ -7688,23 +7621,13 @@
                                       <w:sz w:val="17"/>
                                     </w:rPr>
                                   </w:pPr>
-                                  <w:proofErr w:type="spellStart"/>
                                   <w:r>
                                     <w:rPr>
                                       <w:rFonts w:ascii="Times New Roman" w:hAnsi="Times New Roman"/>
                                       <w:iCs/>
                                       <w:sz w:val="17"/>
                                     </w:rPr>
-                                    <w:t>Изм</w:t>
-                                  </w:r>
-                                  <w:proofErr w:type="spellEnd"/>
-                                  <w:r>
-                                    <w:rPr>
-                                      <w:rFonts w:ascii="Times New Roman" w:hAnsi="Times New Roman"/>
-                                      <w:iCs/>
-                                      <w:sz w:val="17"/>
-                                    </w:rPr>
-                                    <w:t>.</w:t>
+                                    <w:t>Изм.</w:t>
                                   </w:r>
                                 </w:p>
                               </w:tc>
@@ -7766,18 +7689,8 @@
                                       <w:iCs/>
                                       <w:sz w:val="17"/>
                                     </w:rPr>
-                                    <w:t xml:space="preserve">№ </w:t>
+                                    <w:t>№ докум</w:t>
                                   </w:r>
-                                  <w:proofErr w:type="spellStart"/>
-                                  <w:r>
-                                    <w:rPr>
-                                      <w:rFonts w:ascii="Times New Roman" w:hAnsi="Times New Roman"/>
-                                      <w:iCs/>
-                                      <w:sz w:val="17"/>
-                                    </w:rPr>
-                                    <w:t>докум</w:t>
-                                  </w:r>
-                                  <w:proofErr w:type="spellEnd"/>
                                 </w:p>
                               </w:tc>
                               <w:tc>
@@ -7801,7 +7714,6 @@
                                       <w:sz w:val="17"/>
                                     </w:rPr>
                                   </w:pPr>
-                                  <w:proofErr w:type="spellStart"/>
                                   <w:r>
                                     <w:rPr>
                                       <w:rFonts w:ascii="Times New Roman" w:hAnsi="Times New Roman"/>
@@ -7810,7 +7722,6 @@
                                     </w:rPr>
                                     <w:t>Подпись</w:t>
                                   </w:r>
-                                  <w:proofErr w:type="spellEnd"/>
                                 </w:p>
                               </w:tc>
                               <w:tc>
@@ -8376,23 +8287,13 @@
                                 <w:sz w:val="17"/>
                               </w:rPr>
                             </w:pPr>
-                            <w:proofErr w:type="spellStart"/>
                             <w:r>
                               <w:rPr>
                                 <w:rFonts w:ascii="Times New Roman" w:hAnsi="Times New Roman"/>
                                 <w:iCs/>
                                 <w:sz w:val="17"/>
                               </w:rPr>
-                              <w:t>Изм</w:t>
-                            </w:r>
-                            <w:proofErr w:type="spellEnd"/>
-                            <w:r>
-                              <w:rPr>
-                                <w:rFonts w:ascii="Times New Roman" w:hAnsi="Times New Roman"/>
-                                <w:iCs/>
-                                <w:sz w:val="17"/>
-                              </w:rPr>
-                              <w:t>.</w:t>
+                              <w:t>Изм.</w:t>
                             </w:r>
                           </w:p>
                         </w:tc>
@@ -8454,18 +8355,8 @@
                                 <w:iCs/>
                                 <w:sz w:val="17"/>
                               </w:rPr>
-                              <w:t xml:space="preserve">№ </w:t>
+                              <w:t>№ докум</w:t>
                             </w:r>
-                            <w:proofErr w:type="spellStart"/>
-                            <w:r>
-                              <w:rPr>
-                                <w:rFonts w:ascii="Times New Roman" w:hAnsi="Times New Roman"/>
-                                <w:iCs/>
-                                <w:sz w:val="17"/>
-                              </w:rPr>
-                              <w:t>докум</w:t>
-                            </w:r>
-                            <w:proofErr w:type="spellEnd"/>
                           </w:p>
                         </w:tc>
                         <w:tc>
@@ -8489,7 +8380,6 @@
                                 <w:sz w:val="17"/>
                               </w:rPr>
                             </w:pPr>
-                            <w:proofErr w:type="spellStart"/>
                             <w:r>
                               <w:rPr>
                                 <w:rFonts w:ascii="Times New Roman" w:hAnsi="Times New Roman"/>
@@ -8498,7 +8388,6 @@
                               </w:rPr>
                               <w:t>Подпись</w:t>
                             </w:r>
-                            <w:proofErr w:type="spellEnd"/>
                           </w:p>
                         </w:tc>
                         <w:tc>

</xml_diff>